<commit_message>
docs: the ship brief rewritten for 2300 — composite armour, recessed seams, light strips, mag-clamps and hydraulics instead of rivets and rust
Co-Authored-By: Claude Opus 5 <noreply@anthropic.com>
</commit_message>
<xml_diff>
--- a/docs/reference/Ship art - what to generate.docx
+++ b/docs/reference/Ship art - what to generate.docx
@@ -32,7 +32,7 @@
           <w:color w:val="5A6472"/>
           <w:sz w:val="19"/>
         </w:rPr>
-        <w:t>Everything the salvage ship needs: 27 pieces, their exact sizes, and the prompt for each.   ·   23 September 2026</w:t>
+        <w:t>Everything the salvage ship needs: 33 pieces, their exact sizes, and the prompt for each.   ·   23 September 2026</w:t>
       </w:r>
     </w:p>
     <w:p>
@@ -92,7 +92,7 @@
           <w:color w:val="5A6472"/>
           <w:sz w:val="17"/>
         </w:rPr>
-        <w:t>The shape of the ship. Everything here is a shell seen from outside — the floors you stand on and the doors that open are built in the game.</w:t>
+        <w:t>The shape of the ship: 2300 composite armour over an alloy frame, hard-worked and salt-eaten. Everything here is a shell seen from outside — the floors you stand on and the doors that open are built in the game.</w:t>
       </w:r>
     </w:p>
     <w:tbl>
@@ -289,7 +289,7 @@
                 <w:color w:val="5A6472"/>
                 <w:sz w:val="14"/>
               </w:rPr>
-              <w:t>Concept art for a low-poly co-op salvage horror game, year 2300, on an ocean world. Players are futuristic pirates — scavengers, not soldiers — sailing a battered salvage ship over a drowned human colony. The tone is played completely straight: no jokes, no cute. Art direction: stylised and chunky like R.E.P.O. and PEAK — low-poly geometry, flat shading, few colours, bold silhouettes that read from far away. Rusted steel, orange hazard paint, cold sea light. Not photorealistic.</w:t>
+              <w:t>Concept art for a low-poly co-op salvage horror game set in the year 2300, on an ocean world. Players are futuristic pirates — scavengers, not soldiers — crewing a deep-sea salvage ship over a drowned human colony. The technology is 2300, not today: layered composite armour panels with recessed seams and hex plating, ceramic and alloy, exposed conduit with thin cyan and amber light strips, magnetic clamps, hydraulic rams and articulated joints — no rivets, no wood, nothing that looks like a present-day trawler. It is old and hard-worked, never shiny: salt corrosion, biofouling, scarred coatings, repairs clamped over repairs. Orange hazard chevrons are the one thing humans never stopped painting. The tone is played completely straight: no jokes, no cute. Art direction stylised and chunky like R.E.P.O. and PEAK — low-poly geometry, flat shading, few colours, bold silhouettes that read from far away. Not photorealistic.</w:t>
             </w:r>
           </w:p>
           <w:p>
@@ -314,7 +314,7 @@
                 <w:color w:val="1B2430"/>
                 <w:sz w:val="17"/>
               </w:rPr>
-              <w:t>Design a single game asset: THE HULL of a salvage ship, seen from outside — about 44 metres long, 16 metres wide and 7 metres deep. Heavy riveted steel plates, rust streaks, a blunt working bow, a darker band where the water sits. The top is completely open and flat: no deck surface, no railings, no superstructure, no interior — only the hull shell.</w:t>
+              <w:t>Design a single game asset: THE HULL of a 2300 deep-sea salvage ship, seen from outside — about 44 metres long, 16 metres wide and 7 metres deep. Layered composite armour panels with deep recessed seams, a blunt reinforced bow with a sonar bulb, sealed intake grilles, thin cyan light strips recessed along the waterline, magnetic clamp plates on the flanks, salt corrosion and biofouling low down, patch panels clamped over old damage. The top is completely open and flat: no deck surface, no railings, no superstructure, no interior — only the hull shell.</w:t>
             </w:r>
           </w:p>
           <w:p>
@@ -447,7 +447,7 @@
                 <w:color w:val="5A6472"/>
                 <w:sz w:val="14"/>
               </w:rPr>
-              <w:t>Concept art for a low-poly co-op salvage horror game, year 2300, on an ocean world. Players are futuristic pirates — scavengers, not soldiers — sailing a battered salvage ship over a drowned human colony. The tone is played completely straight: no jokes, no cute. Art direction: stylised and chunky like R.E.P.O. and PEAK — low-poly geometry, flat shading, few colours, bold silhouettes that read from far away. Rusted steel, orange hazard paint, cold sea light. Not photorealistic.</w:t>
+              <w:t>Concept art for a low-poly co-op salvage horror game set in the year 2300, on an ocean world. Players are futuristic pirates — scavengers, not soldiers — crewing a deep-sea salvage ship over a drowned human colony. The technology is 2300, not today: layered composite armour panels with recessed seams and hex plating, ceramic and alloy, exposed conduit with thin cyan and amber light strips, magnetic clamps, hydraulic rams and articulated joints — no rivets, no wood, nothing that looks like a present-day trawler. It is old and hard-worked, never shiny: salt corrosion, biofouling, scarred coatings, repairs clamped over repairs. Orange hazard chevrons are the one thing humans never stopped painting. The tone is played completely straight: no jokes, no cute. Art direction stylised and chunky like R.E.P.O. and PEAK — low-poly geometry, flat shading, few colours, bold silhouettes that read from far away. Not photorealistic.</w:t>
             </w:r>
           </w:p>
           <w:p>
@@ -472,7 +472,7 @@
                 <w:color w:val="1B2430"/>
                 <w:sz w:val="17"/>
               </w:rPr>
-              <w:t>Design a single game asset: THE BRIDGE TOWER of a salvage ship — a blocky steel superstructure 8 metres wide, 6 metres deep and 6 metres high, with a completely FLAT empty roof because a walkway lands on it. Wide dark windows across the front, a door on one side, external ladder rungs, a railing round the roof edge, antennas and a small radar mast on top, rust and orange hazard stripes at the base. Outside shell only — no interior and no floors inside.</w:t>
+              <w:t>Design a single game asset: THE BRIDGE TOWER of a 2300 salvage ship — a hard-surface composite superstructure 8 metres wide, 6 metres deep and 6 metres high, with a completely FLAT empty roof because a walkway lands on it. One wide wrap-around armoured viewport with a dark tinted band, a sealed pressure hatch on one side, recessed rungs, a slim railing round the roof edge, a folded sensor array and a phased-array dish on top, cyan light strips tracing the panel seams and orange hazard chevrons at the base. Outside shell only — no interior and no floors inside.</w:t>
             </w:r>
           </w:p>
           <w:p>
@@ -602,7 +602,7 @@
                 <w:color w:val="5A6472"/>
                 <w:sz w:val="14"/>
               </w:rPr>
-              <w:t>Concept art for a low-poly co-op salvage horror game, year 2300, on an ocean world. Players are futuristic pirates — scavengers, not soldiers — sailing a battered salvage ship over a drowned human colony. The tone is played completely straight: no jokes, no cute. Art direction: stylised and chunky like R.E.P.O. and PEAK — low-poly geometry, flat shading, few colours, bold silhouettes that read from far away. Rusted steel, orange hazard paint, cold sea light. Not photorealistic.</w:t>
+              <w:t>Concept art for a low-poly co-op salvage horror game set in the year 2300, on an ocean world. Players are futuristic pirates — scavengers, not soldiers — crewing a deep-sea salvage ship over a drowned human colony. The technology is 2300, not today: layered composite armour panels with recessed seams and hex plating, ceramic and alloy, exposed conduit with thin cyan and amber light strips, magnetic clamps, hydraulic rams and articulated joints — no rivets, no wood, nothing that looks like a present-day trawler. It is old and hard-worked, never shiny: salt corrosion, biofouling, scarred coatings, repairs clamped over repairs. Orange hazard chevrons are the one thing humans never stopped painting. The tone is played completely straight: no jokes, no cute. Art direction stylised and chunky like R.E.P.O. and PEAK — low-poly geometry, flat shading, few colours, bold silhouettes that read from far away. Not photorealistic.</w:t>
             </w:r>
           </w:p>
           <w:p>
@@ -627,7 +627,7 @@
                 <w:color w:val="1B2430"/>
                 <w:sz w:val="17"/>
               </w:rPr>
-              <w:t>Design a single game asset: A SHIP DECK RAILING SECTION exactly 2 metres long and 1.2 metres high — two square posts at the ends, a thick top rail, a thinner middle rail, and a solid kick plate along the bottom painted in orange and black hazard stripes. Rusted steel, chunky and simple. Both ends are flat and identical so many sections join in a straight line.</w:t>
+              <w:t>Design a single game asset: A DECK RAILING SECTION of a 2300 ship, exactly 2 metres long and 1.2 metres high — two squared alloy stanchions at the ends, a thick top rail, a taut cable run instead of a middle bar, and a solid composite kick plate along the bottom in orange and black hazard chevrons with a thin amber light strip above it. Scuffed and salt-etched, chunky and simple. Both ends are flat and identical so many sections join in a straight line.</w:t>
             </w:r>
           </w:p>
           <w:p>
@@ -760,7 +760,7 @@
                 <w:color w:val="5A6472"/>
                 <w:sz w:val="14"/>
               </w:rPr>
-              <w:t>Concept art for a low-poly co-op salvage horror game, year 2300, on an ocean world. Players are futuristic pirates — scavengers, not soldiers — sailing a battered salvage ship over a drowned human colony. The tone is played completely straight: no jokes, no cute. Art direction: stylised and chunky like R.E.P.O. and PEAK — low-poly geometry, flat shading, few colours, bold silhouettes that read from far away. Rusted steel, orange hazard paint, cold sea light. Not photorealistic.</w:t>
+              <w:t>Concept art for a low-poly co-op salvage horror game set in the year 2300, on an ocean world. Players are futuristic pirates — scavengers, not soldiers — crewing a deep-sea salvage ship over a drowned human colony. The technology is 2300, not today: layered composite armour panels with recessed seams and hex plating, ceramic and alloy, exposed conduit with thin cyan and amber light strips, magnetic clamps, hydraulic rams and articulated joints — no rivets, no wood, nothing that looks like a present-day trawler. It is old and hard-worked, never shiny: salt corrosion, biofouling, scarred coatings, repairs clamped over repairs. Orange hazard chevrons are the one thing humans never stopped painting. The tone is played completely straight: no jokes, no cute. Art direction stylised and chunky like R.E.P.O. and PEAK — low-poly geometry, flat shading, few colours, bold silhouettes that read from far away. Not photorealistic.</w:t>
             </w:r>
           </w:p>
           <w:p>
@@ -785,7 +785,7 @@
                 <w:color w:val="1B2430"/>
                 <w:sz w:val="17"/>
               </w:rPr>
-              <w:t>Design a single game asset: A SMALL STEEL STORAGE SHED for a ship deck — 2.8 metres wide, 3 metres deep and 2.2 metres high, welded plate walls with a ribbed flat roof, rust runs, a caged lamp over the entrance and hazard tape round the base. ONE WALL HAS AN OPEN DOORWAY 1.4 metres wide and full height with NO DOOR IN IT — leave that gap completely empty. No floor inside, no interior fittings.</w:t>
+              <w:t>Design a single game asset: A SMALL CARGO MODULE for a 2300 ship deck — 2.8 metres wide, 3 metres deep and 2.2 metres high, composite panel walls with recessed seams and a ribbed flat roof, magnetic deck clamps at the corners, a cyan light strip over the entrance, orange hazard chevrons round the base and corrosion staining at the joints. ONE WALL HAS AN OPEN DOORWAY 1.4 metres wide and full height with NO DOOR IN IT — leave that gap completely empty. No floor inside, no interior fittings.</w:t>
             </w:r>
           </w:p>
           <w:p>
@@ -915,7 +915,7 @@
                 <w:color w:val="5A6472"/>
                 <w:sz w:val="14"/>
               </w:rPr>
-              <w:t>Concept art for a low-poly co-op salvage horror game, year 2300, on an ocean world. Players are futuristic pirates — scavengers, not soldiers — sailing a battered salvage ship over a drowned human colony. The tone is played completely straight: no jokes, no cute. Art direction: stylised and chunky like R.E.P.O. and PEAK — low-poly geometry, flat shading, few colours, bold silhouettes that read from far away. Rusted steel, orange hazard paint, cold sea light. Not photorealistic.</w:t>
+              <w:t>Concept art for a low-poly co-op salvage horror game set in the year 2300, on an ocean world. Players are futuristic pirates — scavengers, not soldiers — crewing a deep-sea salvage ship over a drowned human colony. The technology is 2300, not today: layered composite armour panels with recessed seams and hex plating, ceramic and alloy, exposed conduit with thin cyan and amber light strips, magnetic clamps, hydraulic rams and articulated joints — no rivets, no wood, nothing that looks like a present-day trawler. It is old and hard-worked, never shiny: salt corrosion, biofouling, scarred coatings, repairs clamped over repairs. Orange hazard chevrons are the one thing humans never stopped painting. The tone is played completely straight: no jokes, no cute. Art direction stylised and chunky like R.E.P.O. and PEAK — low-poly geometry, flat shading, few colours, bold silhouettes that read from far away. Not photorealistic.</w:t>
             </w:r>
           </w:p>
           <w:p>
@@ -940,7 +940,7 @@
                 <w:color w:val="1B2430"/>
                 <w:sz w:val="17"/>
               </w:rPr>
-              <w:t>Design a single game asset: A ROUND STEEL HOUSING for a deep-sea elevator shaft on a ship deck — a cylinder 5 metres across and 3 metres high, ribbed with vertical steel frames, heavy bolted flanges top and bottom, orange hazard stripes round the base and a warning lamp over the opening. ONE SIDE HAS AN OPEN DOORWAY 2 metres wide with no doors in it — leave that gap completely empty.</w:t>
+              <w:t>Design a single game asset: THE HOUSING of a deep-sea elevator shaft on a 2300 ship deck — a cylinder 5 metres across and 3 metres high, ribbed with vertical alloy frames over composite panels, heavy pressure flanges top and bottom, hydraulic rams flanking the opening, cyan light strips down the ribs, orange hazard chevrons round the base and an amber beacon over the opening. ONE SIDE HAS AN OPEN DOORWAY 2 metres wide with no doors in it — leave that gap completely empty.</w:t>
             </w:r>
           </w:p>
           <w:p>
@@ -998,7 +998,7 @@
           <w:color w:val="5A6472"/>
           <w:sz w:val="17"/>
         </w:rPr>
-        <w:t>The working gear bolted to the deck. Screens and buttons stay in the game; generate the metal round them.</w:t>
+        <w:t>The working gear clamped to the deck — hydraulics, sealed housings, light strips. Screens and buttons stay in the game; generate the shell round them.</w:t>
       </w:r>
     </w:p>
     <w:tbl>
@@ -1195,7 +1195,7 @@
                 <w:color w:val="5A6472"/>
                 <w:sz w:val="14"/>
               </w:rPr>
-              <w:t>Concept art for a low-poly co-op salvage horror game, year 2300, on an ocean world. Players are futuristic pirates — scavengers, not soldiers — sailing a battered salvage ship over a drowned human colony. The tone is played completely straight: no jokes, no cute. Art direction: stylised and chunky like R.E.P.O. and PEAK — low-poly geometry, flat shading, few colours, bold silhouettes that read from far away. Rusted steel, orange hazard paint, cold sea light. Not photorealistic.</w:t>
+              <w:t>Concept art for a low-poly co-op salvage horror game set in the year 2300, on an ocean world. Players are futuristic pirates — scavengers, not soldiers — crewing a deep-sea salvage ship over a drowned human colony. The technology is 2300, not today: layered composite armour panels with recessed seams and hex plating, ceramic and alloy, exposed conduit with thin cyan and amber light strips, magnetic clamps, hydraulic rams and articulated joints — no rivets, no wood, nothing that looks like a present-day trawler. It is old and hard-worked, never shiny: salt corrosion, biofouling, scarred coatings, repairs clamped over repairs. Orange hazard chevrons are the one thing humans never stopped painting. The tone is played completely straight: no jokes, no cute. Art direction stylised and chunky like R.E.P.O. and PEAK — low-poly geometry, flat shading, few colours, bold silhouettes that read from far away. Not photorealistic.</w:t>
             </w:r>
           </w:p>
           <w:p>
@@ -1220,7 +1220,7 @@
                 <w:color w:val="1B2430"/>
                 <w:sz w:val="17"/>
               </w:rPr>
-              <w:t>Design a single game asset: A SALVAGE SHIP DECK CRANE — a square base 2.2 metres across, a small operator cab with one lit window, a square lattice mast 7 metres tall, and a straight boom 9 metres long reaching out to one side with a hanging cable and a hook. Rusted steel with orange hazard bands on the mast and the boom tip, and a red warning lamp at the top.</w:t>
+              <w:t>Design a single game asset: A SALVAGE CRANE of the year 2300 — a squat armoured base 2.2 metres across on a slewing ring, a small sealed operator pod with one dark curved viewport, a boxed alloy mast 7 metres tall with hydraulic rams along it, and a straight telescopic boom 9 metres long reaching out to one side with a cable and a magnetic grapple head. Composite panels over a visible frame, cyan light strips on the mast, orange hazard chevrons on the boom tip and a red beacon at the top. Worn, salt-etched, hard-worked.</w:t>
             </w:r>
           </w:p>
           <w:p>
@@ -1353,7 +1353,7 @@
                 <w:color w:val="5A6472"/>
                 <w:sz w:val="14"/>
               </w:rPr>
-              <w:t>Concept art for a low-poly co-op salvage horror game, year 2300, on an ocean world. Players are futuristic pirates — scavengers, not soldiers — sailing a battered salvage ship over a drowned human colony. The tone is played completely straight: no jokes, no cute. Art direction: stylised and chunky like R.E.P.O. and PEAK — low-poly geometry, flat shading, few colours, bold silhouettes that read from far away. Rusted steel, orange hazard paint, cold sea light. Not photorealistic.</w:t>
+              <w:t>Concept art for a low-poly co-op salvage horror game set in the year 2300, on an ocean world. Players are futuristic pirates — scavengers, not soldiers — crewing a deep-sea salvage ship over a drowned human colony. The technology is 2300, not today: layered composite armour panels with recessed seams and hex plating, ceramic and alloy, exposed conduit with thin cyan and amber light strips, magnetic clamps, hydraulic rams and articulated joints — no rivets, no wood, nothing that looks like a present-day trawler. It is old and hard-worked, never shiny: salt corrosion, biofouling, scarred coatings, repairs clamped over repairs. Orange hazard chevrons are the one thing humans never stopped painting. The tone is played completely straight: no jokes, no cute. Art direction stylised and chunky like R.E.P.O. and PEAK — low-poly geometry, flat shading, few colours, bold silhouettes that read from far away. Not photorealistic.</w:t>
             </w:r>
           </w:p>
           <w:p>
@@ -1378,7 +1378,7 @@
                 <w:color w:val="1B2430"/>
                 <w:sz w:val="17"/>
               </w:rPr>
-              <w:t>Design a single game asset: A HEAVY SHIP WINCH — a horizontal steel drum about 1.4 metres across wound with thick cable, held in a low welded frame about 2 metres wide, with a gearbox on one side and a control lever. Greasy dark metal, rust, and orange hazard paint on the frame edges.</w:t>
+              <w:t>Design a single game asset: A HEAVY DECK WINCH of the year 2300 — a horizontal drum about 1.4 metres across wound with braided filament cable, held in a low armoured cradle about 2 metres wide, with a sealed drive housing on one side, a hydraulic brake caliper and a small dark status panel. Composite over alloy, an amber light strip along the cradle, oil stains, salt corrosion and orange hazard chevrons on the edges.</w:t>
             </w:r>
           </w:p>
           <w:p>
@@ -1508,7 +1508,7 @@
                 <w:color w:val="5A6472"/>
                 <w:sz w:val="14"/>
               </w:rPr>
-              <w:t>Concept art for a low-poly co-op salvage horror game, year 2300, on an ocean world. Players are futuristic pirates — scavengers, not soldiers — sailing a battered salvage ship over a drowned human colony. The tone is played completely straight: no jokes, no cute. Art direction: stylised and chunky like R.E.P.O. and PEAK — low-poly geometry, flat shading, few colours, bold silhouettes that read from far away. Rusted steel, orange hazard paint, cold sea light. Not photorealistic.</w:t>
+              <w:t>Concept art for a low-poly co-op salvage horror game set in the year 2300, on an ocean world. Players are futuristic pirates — scavengers, not soldiers — crewing a deep-sea salvage ship over a drowned human colony. The technology is 2300, not today: layered composite armour panels with recessed seams and hex plating, ceramic and alloy, exposed conduit with thin cyan and amber light strips, magnetic clamps, hydraulic rams and articulated joints — no rivets, no wood, nothing that looks like a present-day trawler. It is old and hard-worked, never shiny: salt corrosion, biofouling, scarred coatings, repairs clamped over repairs. Orange hazard chevrons are the one thing humans never stopped painting. The tone is played completely straight: no jokes, no cute. Art direction stylised and chunky like R.E.P.O. and PEAK — low-poly geometry, flat shading, few colours, bold silhouettes that read from far away. Not photorealistic.</w:t>
             </w:r>
           </w:p>
           <w:p>
@@ -1533,7 +1533,7 @@
                 <w:color w:val="1B2430"/>
                 <w:sz w:val="17"/>
               </w:rPr>
-              <w:t>Design a single game asset: A BATTERED SHIPPING CONTAINER 6 metres long, 2.6 metres wide and 2.6 metres high — corrugated steel sides, heavy corner castings, a ribbed frame at each end, double doors with locking bars at one end, dents and rust runs. Painted one flat colour worn through to bare metal at the edges. Plain and boxy, with no logos and no text.</w:t>
+              <w:t>Design a single game asset: A CARGO POD of the year 2300, 6 metres long, 2.6 metres wide and 2.6 metres high — smooth composite panels with recessed seams and a hex-pattern band, heavy magnetic corner clamps, a reinforced frame at each end, one sealed hatch with a hydraulic locking ring, a dark inert status strip beside it, dents and corrosion runs. Painted one flat colour scraped through to grey composite at the edges. Plain and boxy, with no logos and no text.</w:t>
             </w:r>
           </w:p>
           <w:p>
@@ -1666,7 +1666,7 @@
                 <w:color w:val="5A6472"/>
                 <w:sz w:val="14"/>
               </w:rPr>
-              <w:t>Concept art for a low-poly co-op salvage horror game, year 2300, on an ocean world. Players are futuristic pirates — scavengers, not soldiers — sailing a battered salvage ship over a drowned human colony. The tone is played completely straight: no jokes, no cute. Art direction: stylised and chunky like R.E.P.O. and PEAK — low-poly geometry, flat shading, few colours, bold silhouettes that read from far away. Rusted steel, orange hazard paint, cold sea light. Not photorealistic.</w:t>
+              <w:t>Concept art for a low-poly co-op salvage horror game set in the year 2300, on an ocean world. Players are futuristic pirates — scavengers, not soldiers — crewing a deep-sea salvage ship over a drowned human colony. The technology is 2300, not today: layered composite armour panels with recessed seams and hex plating, ceramic and alloy, exposed conduit with thin cyan and amber light strips, magnetic clamps, hydraulic rams and articulated joints — no rivets, no wood, nothing that looks like a present-day trawler. It is old and hard-worked, never shiny: salt corrosion, biofouling, scarred coatings, repairs clamped over repairs. Orange hazard chevrons are the one thing humans never stopped painting. The tone is played completely straight: no jokes, no cute. Art direction stylised and chunky like R.E.P.O. and PEAK — low-poly geometry, flat shading, few colours, bold silhouettes that read from far away. Not photorealistic.</w:t>
             </w:r>
           </w:p>
           <w:p>
@@ -1691,7 +1691,7 @@
                 <w:color w:val="1B2430"/>
                 <w:sz w:val="17"/>
               </w:rPr>
-              <w:t>Design a single game asset: A SHIP BRIDGE CONTROL CONSOLE — a steel desk 1.8 metres wide and 1 metre high with a sloped front, cable conduit underneath, and a large rugged screen bezel 1.8 metres wide and 1.2 metres high standing above it. Worn paint, a hazard stripe along the base, empty sockets for buttons on the desk. The screen inside the bezel is completely flat, blank and dark.</w:t>
+              <w:t>Design a single game asset: A SHIP BRIDGE CONSOLE of the year 2300 — a composite desk 1.8 metres wide and 1 metre high with a sloped face, cable conduit and cooling fins underneath, and a large armoured display bezel 1.8 metres wide and 1.2 metres high standing above it on two struts. Recessed seams, a cyan light strip under the lip, a hazard chevron along the base and empty recessed sockets where buttons will go. The screen inside the bezel is completely flat, blank and dark.</w:t>
             </w:r>
           </w:p>
           <w:p>
@@ -1821,7 +1821,7 @@
                 <w:color w:val="5A6472"/>
                 <w:sz w:val="14"/>
               </w:rPr>
-              <w:t>Concept art for a low-poly co-op salvage horror game, year 2300, on an ocean world. Players are futuristic pirates — scavengers, not soldiers — sailing a battered salvage ship over a drowned human colony. The tone is played completely straight: no jokes, no cute. Art direction: stylised and chunky like R.E.P.O. and PEAK — low-poly geometry, flat shading, few colours, bold silhouettes that read from far away. Rusted steel, orange hazard paint, cold sea light. Not photorealistic.</w:t>
+              <w:t>Concept art for a low-poly co-op salvage horror game set in the year 2300, on an ocean world. Players are futuristic pirates — scavengers, not soldiers — crewing a deep-sea salvage ship over a drowned human colony. The technology is 2300, not today: layered composite armour panels with recessed seams and hex plating, ceramic and alloy, exposed conduit with thin cyan and amber light strips, magnetic clamps, hydraulic rams and articulated joints — no rivets, no wood, nothing that looks like a present-day trawler. It is old and hard-worked, never shiny: salt corrosion, biofouling, scarred coatings, repairs clamped over repairs. Orange hazard chevrons are the one thing humans never stopped painting. The tone is played completely straight: no jokes, no cute. Art direction stylised and chunky like R.E.P.O. and PEAK — low-poly geometry, flat shading, few colours, bold silhouettes that read from far away. Not photorealistic.</w:t>
             </w:r>
           </w:p>
           <w:p>
@@ -1846,7 +1846,7 @@
                 <w:color w:val="1B2430"/>
                 <w:sz w:val="17"/>
               </w:rPr>
-              <w:t>Design a single game asset: AN OUTDOOR SCREEN CABINET for a ship deck — a wide rugged steel frame 2.2 metres across and 1.4 metres high on a single square post 1 metre tall, with a rain hood over the top, cable conduit down the post and rubber seals round the bezel. The screen area inside the frame is completely flat, blank and dark — no picture and no reflection.</w:t>
+              <w:t>Design a single game asset: AN OUTDOOR DISPLAY CABINET for a 2300 ship deck — a wide armoured bezel 2.2 metres across and 1.4 metres high on a single squared post 1 metre tall, with a sealed hood over the top, cable conduit down the post, a thin cyan light strip along its lower edge and pressure seals round the frame. Composite over alloy, salt-etched. The screen area inside the frame is completely flat, blank and dark — no picture and no reflection.</w:t>
             </w:r>
           </w:p>
           <w:p>
@@ -1979,7 +1979,7 @@
                 <w:color w:val="5A6472"/>
                 <w:sz w:val="14"/>
               </w:rPr>
-              <w:t>Concept art for a low-poly co-op salvage horror game, year 2300, on an ocean world. Players are futuristic pirates — scavengers, not soldiers — sailing a battered salvage ship over a drowned human colony. The tone is played completely straight: no jokes, no cute. Art direction: stylised and chunky like R.E.P.O. and PEAK — low-poly geometry, flat shading, few colours, bold silhouettes that read from far away. Rusted steel, orange hazard paint, cold sea light. Not photorealistic.</w:t>
+              <w:t>Concept art for a low-poly co-op salvage horror game set in the year 2300, on an ocean world. Players are futuristic pirates — scavengers, not soldiers — crewing a deep-sea salvage ship over a drowned human colony. The technology is 2300, not today: layered composite armour panels with recessed seams and hex plating, ceramic and alloy, exposed conduit with thin cyan and amber light strips, magnetic clamps, hydraulic rams and articulated joints — no rivets, no wood, nothing that looks like a present-day trawler. It is old and hard-worked, never shiny: salt corrosion, biofouling, scarred coatings, repairs clamped over repairs. Orange hazard chevrons are the one thing humans never stopped painting. The tone is played completely straight: no jokes, no cute. Art direction stylised and chunky like R.E.P.O. and PEAK — low-poly geometry, flat shading, few colours, bold silhouettes that read from far away. Not photorealistic.</w:t>
             </w:r>
           </w:p>
           <w:p>
@@ -2004,7 +2004,7 @@
                 <w:color w:val="1B2430"/>
                 <w:sz w:val="17"/>
               </w:rPr>
-              <w:t>Design a single game asset: A DECK FLOODLIGHT on a short square steel post 1.35 metres tall, with a boxy lamp head about 0.5 metres across under a flat rain hood, a caged orange lens, bolts at the base and a cable running down the post. Rusted, industrial, simple.</w:t>
+              <w:t>Design a single game asset: A DECK FLOODLIGHT of the year 2300 on a short squared post 1.35 metres tall, with a boxy sealed head about 0.5 metres across under a flat hood, a recessed amber panel lens behind a slim guard, cooling fins at the back, a magnetic base plate and conduit running down the post. Composite and alloy, salt-etched, industrial, simple.</w:t>
             </w:r>
           </w:p>
           <w:p>
@@ -2259,7 +2259,7 @@
                 <w:color w:val="5A6472"/>
                 <w:sz w:val="14"/>
               </w:rPr>
-              <w:t>Concept art for a low-poly co-op salvage horror game, year 2300, on an ocean world. Players are futuristic pirates — scavengers, not soldiers — sailing a battered salvage ship over a drowned human colony. The tone is played completely straight: no jokes, no cute. Art direction: stylised and chunky like R.E.P.O. and PEAK — low-poly geometry, flat shading, few colours, bold silhouettes that read from far away. Rusted steel, orange hazard paint, cold sea light. Not photorealistic.</w:t>
+              <w:t>Concept art for a low-poly co-op salvage horror game set in the year 2300, on an ocean world. Players are futuristic pirates — scavengers, not soldiers — crewing a deep-sea salvage ship over a drowned human colony. The technology is 2300, not today: layered composite armour panels with recessed seams and hex plating, ceramic and alloy, exposed conduit with thin cyan and amber light strips, magnetic clamps, hydraulic rams and articulated joints — no rivets, no wood, nothing that looks like a present-day trawler. It is old and hard-worked, never shiny: salt corrosion, biofouling, scarred coatings, repairs clamped over repairs. Orange hazard chevrons are the one thing humans never stopped painting. The tone is played completely straight: no jokes, no cute. Art direction stylised and chunky like R.E.P.O. and PEAK — low-poly geometry, flat shading, few colours, bold silhouettes that read from far away. Not photorealistic.</w:t>
             </w:r>
           </w:p>
           <w:p>
@@ -2284,7 +2284,7 @@
                 <w:color w:val="1B2430"/>
                 <w:sz w:val="17"/>
               </w:rPr>
-              <w:t>Design a single game asset: ONE LEAF of a heavy sliding steel door for a deep-sea elevator — 1 metre wide, 2.6 metres tall and 10 cm thick, slightly curved as if it belongs to a round cabin, with a narrow reinforced window slit at head height, ribbed bracing, a rubber seal down one long edge, rust and orange hazard stripes. One flat leaf standing upright on its own — not a pair, not a frame.</w:t>
+              <w:t>Design a single game asset: ONE LEAF of a pressure door for a 2300 deep-sea elevator — 1 metre wide, 2.6 metres tall and 10 cm thick, gently curved as if it belongs to a round cabin: a composite face with recessed seams, a narrow armoured viewing slit at head height, interlocking teeth down the closing edge, a pressure seal, a cyan light strip and orange hazard chevrons. One leaf standing upright on its own — not a pair, not a frame.</w:t>
             </w:r>
           </w:p>
           <w:p>
@@ -2417,7 +2417,7 @@
                 <w:color w:val="5A6472"/>
                 <w:sz w:val="14"/>
               </w:rPr>
-              <w:t>Concept art for a low-poly co-op salvage horror game, year 2300, on an ocean world. Players are futuristic pirates — scavengers, not soldiers — sailing a battered salvage ship over a drowned human colony. The tone is played completely straight: no jokes, no cute. Art direction: stylised and chunky like R.E.P.O. and PEAK — low-poly geometry, flat shading, few colours, bold silhouettes that read from far away. Rusted steel, orange hazard paint, cold sea light. Not photorealistic.</w:t>
+              <w:t>Concept art for a low-poly co-op salvage horror game set in the year 2300, on an ocean world. Players are futuristic pirates — scavengers, not soldiers — crewing a deep-sea salvage ship over a drowned human colony. The technology is 2300, not today: layered composite armour panels with recessed seams and hex plating, ceramic and alloy, exposed conduit with thin cyan and amber light strips, magnetic clamps, hydraulic rams and articulated joints — no rivets, no wood, nothing that looks like a present-day trawler. It is old and hard-worked, never shiny: salt corrosion, biofouling, scarred coatings, repairs clamped over repairs. Orange hazard chevrons are the one thing humans never stopped painting. The tone is played completely straight: no jokes, no cute. Art direction stylised and chunky like R.E.P.O. and PEAK — low-poly geometry, flat shading, few colours, bold silhouettes that read from far away. Not photorealistic.</w:t>
             </w:r>
           </w:p>
           <w:p>
@@ -2442,7 +2442,7 @@
                 <w:color w:val="1B2430"/>
                 <w:sz w:val="17"/>
               </w:rPr>
-              <w:t>Design a single game asset: A LOW STEEL THRESHOLD PLATE for a doorway — 1.4 metres wide and 12 cm high, a worn ridged step painted in orange and black hazard stripes, scuffed to bare metal in the middle where boots cross it, bolts along both ends.</w:t>
+              <w:t>Design a single game asset: A LOW THRESHOLD PLATE for a 2300 ship doorway — 1.4 metres wide and 12 cm high, a ridged composite step with a recessed drain channel and a thin amber strip along its front edge, painted in orange hazard chevrons worn through to grey where boots cross, with magnetic fixings at both ends.</w:t>
             </w:r>
           </w:p>
           <w:p>
@@ -2500,7 +2500,7 @@
           <w:color w:val="5A6472"/>
           <w:sz w:val="17"/>
         </w:rPr>
-        <w:t>The small stuff that makes the ship look worked on rather than modelled. This is the batch that changes the feel most — generate them all.</w:t>
+        <w:t>The small stuff that makes the ship look lived in rather than modelled: 2300 kit, worn to nothing. This batch changes the feel most — generate them all.</w:t>
       </w:r>
     </w:p>
     <w:tbl>
@@ -2697,7 +2697,7 @@
                 <w:color w:val="5A6472"/>
                 <w:sz w:val="14"/>
               </w:rPr>
-              <w:t>Concept art for a low-poly co-op salvage horror game, year 2300, on an ocean world. Players are futuristic pirates — scavengers, not soldiers — sailing a battered salvage ship over a drowned human colony. The tone is played completely straight: no jokes, no cute. Art direction: stylised and chunky like R.E.P.O. and PEAK — low-poly geometry, flat shading, few colours, bold silhouettes that read from far away. Rusted steel, orange hazard paint, cold sea light. Not photorealistic.</w:t>
+              <w:t>Concept art for a low-poly co-op salvage horror game set in the year 2300, on an ocean world. Players are futuristic pirates — scavengers, not soldiers — crewing a deep-sea salvage ship over a drowned human colony. The technology is 2300, not today: layered composite armour panels with recessed seams and hex plating, ceramic and alloy, exposed conduit with thin cyan and amber light strips, magnetic clamps, hydraulic rams and articulated joints — no rivets, no wood, nothing that looks like a present-day trawler. It is old and hard-worked, never shiny: salt corrosion, biofouling, scarred coatings, repairs clamped over repairs. Orange hazard chevrons are the one thing humans never stopped painting. The tone is played completely straight: no jokes, no cute. Art direction stylised and chunky like R.E.P.O. and PEAK — low-poly geometry, flat shading, few colours, bold silhouettes that read from far away. Not photorealistic.</w:t>
             </w:r>
           </w:p>
           <w:p>
@@ -2722,7 +2722,7 @@
                 <w:color w:val="1B2430"/>
                 <w:sz w:val="17"/>
               </w:rPr>
-              <w:t>Design a single game asset: A STEEL MOORING BOLLARD for a ship deck — a stout post 40 cm across and 60 cm tall with a flared cap and a bolted base plate, thick rope worn shiny into the neck, rust and chipped orange paint.</w:t>
+              <w:t>Design a single game asset: A MOORING CLEAT of the year 2300 for a ship deck — a stout alloy post 40 cm across and 60 cm tall with a flared magnetic cap and a recessed base ring carrying a thin amber indicator strip, braided filament line worn shiny into the neck, salt corrosion and chipped orange hazard paint.</w:t>
             </w:r>
           </w:p>
           <w:p>
@@ -2855,7 +2855,7 @@
                 <w:color w:val="5A6472"/>
                 <w:sz w:val="14"/>
               </w:rPr>
-              <w:t>Concept art for a low-poly co-op salvage horror game, year 2300, on an ocean world. Players are futuristic pirates — scavengers, not soldiers — sailing a battered salvage ship over a drowned human colony. The tone is played completely straight: no jokes, no cute. Art direction: stylised and chunky like R.E.P.O. and PEAK — low-poly geometry, flat shading, few colours, bold silhouettes that read from far away. Rusted steel, orange hazard paint, cold sea light. Not photorealistic.</w:t>
+              <w:t>Concept art for a low-poly co-op salvage horror game set in the year 2300, on an ocean world. Players are futuristic pirates — scavengers, not soldiers — crewing a deep-sea salvage ship over a drowned human colony. The technology is 2300, not today: layered composite armour panels with recessed seams and hex plating, ceramic and alloy, exposed conduit with thin cyan and amber light strips, magnetic clamps, hydraulic rams and articulated joints — no rivets, no wood, nothing that looks like a present-day trawler. It is old and hard-worked, never shiny: salt corrosion, biofouling, scarred coatings, repairs clamped over repairs. Orange hazard chevrons are the one thing humans never stopped painting. The tone is played completely straight: no jokes, no cute. Art direction stylised and chunky like R.E.P.O. and PEAK — low-poly geometry, flat shading, few colours, bold silhouettes that read from far away. Not photorealistic.</w:t>
             </w:r>
           </w:p>
           <w:p>
@@ -2880,7 +2880,7 @@
                 <w:color w:val="1B2430"/>
                 <w:sz w:val="17"/>
               </w:rPr>
-              <w:t>Design a single game asset: A CLUSTER OF SHIP PIPES AND VENTS — a group of thick steel pipes 2 metres wide and 1.5 metres tall running along a wall with elbow bends, flange joints, two mushroom vent caps and a small pressure gauge. Rusted, lagged in places with cracked insulation, hazard paint on one valve wheel. Free-standing group, no wall behind it.</w:t>
+              <w:t>Design a single game asset: A CLUSTER OF CONDUIT AND HEAT EXCHANGERS from a 2300 ship — a group 2 metres wide and 1.5 metres tall running along a wall: sealed conduit runs with clamp collars and elbow bends, two finned exchanger blocks, a coolant reservoir with a dark gauge panel, a cyan light strip tracing one run and orange hazard chevrons on an isolation valve. Corroded at the joints, cracked lagging. Free-standing group, no wall behind it.</w:t>
             </w:r>
           </w:p>
           <w:p>
@@ -3010,7 +3010,7 @@
                 <w:color w:val="5A6472"/>
                 <w:sz w:val="14"/>
               </w:rPr>
-              <w:t>Concept art for a low-poly co-op salvage horror game, year 2300, on an ocean world. Players are futuristic pirates — scavengers, not soldiers — sailing a battered salvage ship over a drowned human colony. The tone is played completely straight: no jokes, no cute. Art direction: stylised and chunky like R.E.P.O. and PEAK — low-poly geometry, flat shading, few colours, bold silhouettes that read from far away. Rusted steel, orange hazard paint, cold sea light. Not photorealistic.</w:t>
+              <w:t>Concept art for a low-poly co-op salvage horror game set in the year 2300, on an ocean world. Players are futuristic pirates — scavengers, not soldiers — crewing a deep-sea salvage ship over a drowned human colony. The technology is 2300, not today: layered composite armour panels with recessed seams and hex plating, ceramic and alloy, exposed conduit with thin cyan and amber light strips, magnetic clamps, hydraulic rams and articulated joints — no rivets, no wood, nothing that looks like a present-day trawler. It is old and hard-worked, never shiny: salt corrosion, biofouling, scarred coatings, repairs clamped over repairs. Orange hazard chevrons are the one thing humans never stopped painting. The tone is played completely straight: no jokes, no cute. Art direction stylised and chunky like R.E.P.O. and PEAK — low-poly geometry, flat shading, few colours, bold silhouettes that read from far away. Not photorealistic.</w:t>
             </w:r>
           </w:p>
           <w:p>
@@ -3035,7 +3035,7 @@
                 <w:color w:val="1B2430"/>
                 <w:sz w:val="17"/>
               </w:rPr>
-              <w:t>Design a single game asset: A STEEL WALL LADDER 50 cm wide and 3 metres tall — two flat side rails, round rungs, welded stand-off brackets at top and bottom, heavy rust and worn yellow paint on the top rung. Free-standing, no wall behind it.</w:t>
+              <w:t>Design a single game asset: A WALL LADDER of the year 2300, 50 cm wide and 3 metres tall — two flat alloy side rails with recessed grip rungs, magnetic stand-off brackets at top and bottom, a thin amber strip up one rail, salt corrosion and worn orange paint on the top rung. Free-standing, no wall behind it.</w:t>
             </w:r>
           </w:p>
           <w:p>
@@ -3168,7 +3168,7 @@
                 <w:color w:val="5A6472"/>
                 <w:sz w:val="14"/>
               </w:rPr>
-              <w:t>Concept art for a low-poly co-op salvage horror game, year 2300, on an ocean world. Players are futuristic pirates — scavengers, not soldiers — sailing a battered salvage ship over a drowned human colony. The tone is played completely straight: no jokes, no cute. Art direction: stylised and chunky like R.E.P.O. and PEAK — low-poly geometry, flat shading, few colours, bold silhouettes that read from far away. Rusted steel, orange hazard paint, cold sea light. Not photorealistic.</w:t>
+              <w:t>Concept art for a low-poly co-op salvage horror game set in the year 2300, on an ocean world. Players are futuristic pirates — scavengers, not soldiers — crewing a deep-sea salvage ship over a drowned human colony. The technology is 2300, not today: layered composite armour panels with recessed seams and hex plating, ceramic and alloy, exposed conduit with thin cyan and amber light strips, magnetic clamps, hydraulic rams and articulated joints — no rivets, no wood, nothing that looks like a present-day trawler. It is old and hard-worked, never shiny: salt corrosion, biofouling, scarred coatings, repairs clamped over repairs. Orange hazard chevrons are the one thing humans never stopped painting. The tone is played completely straight: no jokes, no cute. Art direction stylised and chunky like R.E.P.O. and PEAK — low-poly geometry, flat shading, few colours, bold silhouettes that read from far away. Not photorealistic.</w:t>
             </w:r>
           </w:p>
           <w:p>
@@ -3193,7 +3193,7 @@
                 <w:color w:val="1B2430"/>
                 <w:sz w:val="17"/>
               </w:rPr>
-              <w:t>Design a single game asset: A DENTED STEEL DRUM 60 cm across and 90 cm tall — ribbed sides, a sealed lid with a bung, rust round the base and one faded hazard band. Plain, no readable text.</w:t>
+              <w:t>Design a single game asset: A PRESSURE CANISTER of the year 2300, 60 cm across and 90 cm tall — a ribbed composite body with a banded alloy collar, a recessed valve head under a guard, a dark inert level strip down one side, dents and corrosion round the base and one faded orange hazard band. Plain, no readable text.</w:t>
             </w:r>
           </w:p>
           <w:p>
@@ -3323,7 +3323,7 @@
                 <w:color w:val="5A6472"/>
                 <w:sz w:val="14"/>
               </w:rPr>
-              <w:t>Concept art for a low-poly co-op salvage horror game, year 2300, on an ocean world. Players are futuristic pirates — scavengers, not soldiers — sailing a battered salvage ship over a drowned human colony. The tone is played completely straight: no jokes, no cute. Art direction: stylised and chunky like R.E.P.O. and PEAK — low-poly geometry, flat shading, few colours, bold silhouettes that read from far away. Rusted steel, orange hazard paint, cold sea light. Not photorealistic.</w:t>
+              <w:t>Concept art for a low-poly co-op salvage horror game set in the year 2300, on an ocean world. Players are futuristic pirates — scavengers, not soldiers — crewing a deep-sea salvage ship over a drowned human colony. The technology is 2300, not today: layered composite armour panels with recessed seams and hex plating, ceramic and alloy, exposed conduit with thin cyan and amber light strips, magnetic clamps, hydraulic rams and articulated joints — no rivets, no wood, nothing that looks like a present-day trawler. It is old and hard-worked, never shiny: salt corrosion, biofouling, scarred coatings, repairs clamped over repairs. Orange hazard chevrons are the one thing humans never stopped painting. The tone is played completely straight: no jokes, no cute. Art direction stylised and chunky like R.E.P.O. and PEAK — low-poly geometry, flat shading, few colours, bold silhouettes that read from far away. Not photorealistic.</w:t>
             </w:r>
           </w:p>
           <w:p>
@@ -3348,7 +3348,7 @@
                 <w:color w:val="1B2430"/>
                 <w:sz w:val="17"/>
               </w:rPr>
-              <w:t>Design a single game asset: A BATTERED SALVAGE CRATE 80 cm long, 60 cm wide and 60 cm tall — steel-cornered with scuffed composite panels, two latches on the lid, a carrying handle each end, chipped paint and salt stains. No text, no logos.</w:t>
+              <w:t>Design a single game asset: A SALVAGE CASE of the year 2300, 80 cm long, 60 cm wide and 60 cm tall — a moulded composite shell with recessed seams and reinforced corners, scuffed panels, two heavy over-centre latches, a recessed handle at each end, a dark inert status strip on the lid, chipped hazard paint and salt stains. No text, no logos.</w:t>
             </w:r>
           </w:p>
           <w:p>
@@ -3481,7 +3481,7 @@
                 <w:color w:val="5A6472"/>
                 <w:sz w:val="14"/>
               </w:rPr>
-              <w:t>Concept art for a low-poly co-op salvage horror game, year 2300, on an ocean world. Players are futuristic pirates — scavengers, not soldiers — sailing a battered salvage ship over a drowned human colony. The tone is played completely straight: no jokes, no cute. Art direction: stylised and chunky like R.E.P.O. and PEAK — low-poly geometry, flat shading, few colours, bold silhouettes that read from far away. Rusted steel, orange hazard paint, cold sea light. Not photorealistic.</w:t>
+              <w:t>Concept art for a low-poly co-op salvage horror game set in the year 2300, on an ocean world. Players are futuristic pirates — scavengers, not soldiers — crewing a deep-sea salvage ship over a drowned human colony. The technology is 2300, not today: layered composite armour panels with recessed seams and hex plating, ceramic and alloy, exposed conduit with thin cyan and amber light strips, magnetic clamps, hydraulic rams and articulated joints — no rivets, no wood, nothing that looks like a present-day trawler. It is old and hard-worked, never shiny: salt corrosion, biofouling, scarred coatings, repairs clamped over repairs. Orange hazard chevrons are the one thing humans never stopped painting. The tone is played completely straight: no jokes, no cute. Art direction stylised and chunky like R.E.P.O. and PEAK — low-poly geometry, flat shading, few colours, bold silhouettes that read from far away. Not photorealistic.</w:t>
             </w:r>
           </w:p>
           <w:p>
@@ -3506,7 +3506,7 @@
                 <w:color w:val="1B2430"/>
                 <w:sz w:val="17"/>
               </w:rPr>
-              <w:t>Design a single game asset: A COIL OF HEAVY SHIP CABLE lying flat on the ground — 1.2 metres across and 30 cm high, thick wound steel rope with a frayed end and a shackle, oily and salt-stained.</w:t>
+              <w:t>Design a single game asset: A COIL OF HEAVY SALVAGE LINE lying flat on the ground — 1.2 metres across and 30 cm high, thick braided filament cable in a woven sheath with a magnetic coupling head on the loose end and a clamp collar holding the coil, oily and salt-stained.</w:t>
             </w:r>
           </w:p>
           <w:p>
@@ -3636,7 +3636,7 @@
                 <w:color w:val="5A6472"/>
                 <w:sz w:val="14"/>
               </w:rPr>
-              <w:t>Concept art for a low-poly co-op salvage horror game, year 2300, on an ocean world. Players are futuristic pirates — scavengers, not soldiers — sailing a battered salvage ship over a drowned human colony. The tone is played completely straight: no jokes, no cute. Art direction: stylised and chunky like R.E.P.O. and PEAK — low-poly geometry, flat shading, few colours, bold silhouettes that read from far away. Rusted steel, orange hazard paint, cold sea light. Not photorealistic.</w:t>
+              <w:t>Concept art for a low-poly co-op salvage horror game set in the year 2300, on an ocean world. Players are futuristic pirates — scavengers, not soldiers — crewing a deep-sea salvage ship over a drowned human colony. The technology is 2300, not today: layered composite armour panels with recessed seams and hex plating, ceramic and alloy, exposed conduit with thin cyan and amber light strips, magnetic clamps, hydraulic rams and articulated joints — no rivets, no wood, nothing that looks like a present-day trawler. It is old and hard-worked, never shiny: salt corrosion, biofouling, scarred coatings, repairs clamped over repairs. Orange hazard chevrons are the one thing humans never stopped painting. The tone is played completely straight: no jokes, no cute. Art direction stylised and chunky like R.E.P.O. and PEAK — low-poly geometry, flat shading, few colours, bold silhouettes that read from far away. Not photorealistic.</w:t>
             </w:r>
           </w:p>
           <w:p>
@@ -3661,7 +3661,7 @@
                 <w:color w:val="1B2430"/>
                 <w:sz w:val="17"/>
               </w:rPr>
-              <w:t>Design a single game asset: A LIFEBUOY ON A POST — an 80 cm orange and white ring buoy with a rope loop, hung on a simple steel bracket post 1.2 metres tall. Weathered, salt-stained, the orange faded. No text on the ring.</w:t>
+              <w:t>Design a single game asset: AN EMERGENCY BUOYANCY RING ON A POST of the year 2300 — an 80 cm ring of segmented orange and white composite with an inflation collar and a small dark beacon module, hung on a slim alloy bracket post 1.2 metres tall with an amber strip at its base. Weathered, salt-stained, the orange faded. No text on the ring.</w:t>
             </w:r>
           </w:p>
           <w:p>
@@ -3794,7 +3794,7 @@
                 <w:color w:val="5A6472"/>
                 <w:sz w:val="14"/>
               </w:rPr>
-              <w:t>Concept art for a low-poly co-op salvage horror game, year 2300, on an ocean world. Players are futuristic pirates — scavengers, not soldiers — sailing a battered salvage ship over a drowned human colony. The tone is played completely straight: no jokes, no cute. Art direction: stylised and chunky like R.E.P.O. and PEAK — low-poly geometry, flat shading, few colours, bold silhouettes that read from far away. Rusted steel, orange hazard paint, cold sea light. Not photorealistic.</w:t>
+              <w:t>Concept art for a low-poly co-op salvage horror game set in the year 2300, on an ocean world. Players are futuristic pirates — scavengers, not soldiers — crewing a deep-sea salvage ship over a drowned human colony. The technology is 2300, not today: layered composite armour panels with recessed seams and hex plating, ceramic and alloy, exposed conduit with thin cyan and amber light strips, magnetic clamps, hydraulic rams and articulated joints — no rivets, no wood, nothing that looks like a present-day trawler. It is old and hard-worked, never shiny: salt corrosion, biofouling, scarred coatings, repairs clamped over repairs. Orange hazard chevrons are the one thing humans never stopped painting. The tone is played completely straight: no jokes, no cute. Art direction stylised and chunky like R.E.P.O. and PEAK — low-poly geometry, flat shading, few colours, bold silhouettes that read from far away. Not photorealistic.</w:t>
             </w:r>
           </w:p>
           <w:p>
@@ -3819,7 +3819,7 @@
                 <w:color w:val="1B2430"/>
                 <w:sz w:val="17"/>
               </w:rPr>
-              <w:t>Design a single game asset: A BATTERED METAL TOOLBOX 70 cm long, 40 cm wide and 40 cm tall — hinged lid partly open, a folding handle, two latches, chipped red paint over bare steel, grease marks. No text.</w:t>
+              <w:t>Design a single game asset: A FIELD TOOL CASE of the year 2300, 70 cm long, 40 cm wide and 40 cm tall — a moulded composite shell, its hinged lid partly open showing shaped foam recesses, a recessed handle, two latches, a dark inert charge strip on the side, chipped orange paint over grey composite and grease marks. No text.</w:t>
             </w:r>
           </w:p>
           <w:p>
@@ -4074,7 +4074,7 @@
                 <w:color w:val="5A6472"/>
                 <w:sz w:val="14"/>
               </w:rPr>
-              <w:t>Concept art for a low-poly co-op salvage horror game, year 2300, on an ocean world. Players are futuristic pirates — scavengers, not soldiers — sailing a battered salvage ship over a drowned human colony. The tone is played completely straight: no jokes, no cute. Art direction: stylised and chunky like R.E.P.O. and PEAK — low-poly geometry, flat shading, few colours, bold silhouettes that read from far away. Rusted steel, orange hazard paint, cold sea light. Not photorealistic.</w:t>
+              <w:t>Concept art for a low-poly co-op salvage horror game set in the year 2300, on an ocean world. Players are futuristic pirates — scavengers, not soldiers — crewing a deep-sea salvage ship over a drowned human colony. The technology is 2300, not today: layered composite armour panels with recessed seams and hex plating, ceramic and alloy, exposed conduit with thin cyan and amber light strips, magnetic clamps, hydraulic rams and articulated joints — no rivets, no wood, nothing that looks like a present-day trawler. It is old and hard-worked, never shiny: salt corrosion, biofouling, scarred coatings, repairs clamped over repairs. Orange hazard chevrons are the one thing humans never stopped painting. The tone is played completely straight: no jokes, no cute. Art direction stylised and chunky like R.E.P.O. and PEAK — low-poly geometry, flat shading, few colours, bold silhouettes that read from far away. Not photorealistic.</w:t>
             </w:r>
           </w:p>
           <w:p>
@@ -4099,7 +4099,7 @@
                 <w:color w:val="1B2430"/>
                 <w:sz w:val="17"/>
               </w:rPr>
-              <w:t>Design a single game asset: A BATTERED CREW COUCH for a working ship — 2 metres long, 85 cm deep and 80 cm tall, a low bolted steel frame with thick worn cushions in dull green vinyl, tape over a split seam, the arms rubbed through to the foam, bolts through the feet into the floor. Heavy, cheap, industrial — not a home sofa.</w:t>
+              <w:t>Design a single game asset: A CREW COUCH from a 2300 ship — 2 metres long, 85 cm deep and 80 cm tall: a low moulded composite shell on a magnetic deck base, thick worn cushions in dull teal synthetic, repair tape over a split seam, the arms rubbed through to the foam, a thin amber strip along the base and a recessed cup well in one arm, clamped to the floor. Heavy, cheap, industrial — not a home sofa.</w:t>
             </w:r>
           </w:p>
           <w:p>
@@ -4232,7 +4232,7 @@
                 <w:color w:val="5A6472"/>
                 <w:sz w:val="14"/>
               </w:rPr>
-              <w:t>Concept art for a low-poly co-op salvage horror game, year 2300, on an ocean world. Players are futuristic pirates — scavengers, not soldiers — sailing a battered salvage ship over a drowned human colony. The tone is played completely straight: no jokes, no cute. Art direction: stylised and chunky like R.E.P.O. and PEAK — low-poly geometry, flat shading, few colours, bold silhouettes that read from far away. Rusted steel, orange hazard paint, cold sea light. Not photorealistic.</w:t>
+              <w:t>Concept art for a low-poly co-op salvage horror game set in the year 2300, on an ocean world. Players are futuristic pirates — scavengers, not soldiers — crewing a deep-sea salvage ship over a drowned human colony. The technology is 2300, not today: layered composite armour panels with recessed seams and hex plating, ceramic and alloy, exposed conduit with thin cyan and amber light strips, magnetic clamps, hydraulic rams and articulated joints — no rivets, no wood, nothing that looks like a present-day trawler. It is old and hard-worked, never shiny: salt corrosion, biofouling, scarred coatings, repairs clamped over repairs. Orange hazard chevrons are the one thing humans never stopped painting. The tone is played completely straight: no jokes, no cute. Art direction stylised and chunky like R.E.P.O. and PEAK — low-poly geometry, flat shading, few colours, bold silhouettes that read from far away. Not photorealistic.</w:t>
             </w:r>
           </w:p>
           <w:p>
@@ -4257,7 +4257,7 @@
                 <w:color w:val="1B2430"/>
                 <w:sz w:val="17"/>
               </w:rPr>
-              <w:t>Design a single game asset: A SHIP CREW BENCH — 1.6 metres long and 45 cm tall, slatted steel seat on a welded frame bolted to the floor, a shallow rack underneath, chipped grey paint over rust, one slat replaced with bare metal.</w:t>
+              <w:t>Design a single game asset: A CREW BENCH from a 2300 ship — 1.6 metres long and 45 cm tall, a slatted composite seat on a slim alloy frame magnetically clamped to the floor, a shallow gear rack underneath, chipped grey paint, salt corrosion, one slat replaced with a mismatched panel.</w:t>
             </w:r>
           </w:p>
           <w:p>
@@ -4387,7 +4387,7 @@
                 <w:color w:val="5A6472"/>
                 <w:sz w:val="14"/>
               </w:rPr>
-              <w:t>Concept art for a low-poly co-op salvage horror game, year 2300, on an ocean world. Players are futuristic pirates — scavengers, not soldiers — sailing a battered salvage ship over a drowned human colony. The tone is played completely straight: no jokes, no cute. Art direction: stylised and chunky like R.E.P.O. and PEAK — low-poly geometry, flat shading, few colours, bold silhouettes that read from far away. Rusted steel, orange hazard paint, cold sea light. Not photorealistic.</w:t>
+              <w:t>Concept art for a low-poly co-op salvage horror game set in the year 2300, on an ocean world. Players are futuristic pirates — scavengers, not soldiers — crewing a deep-sea salvage ship over a drowned human colony. The technology is 2300, not today: layered composite armour panels with recessed seams and hex plating, ceramic and alloy, exposed conduit with thin cyan and amber light strips, magnetic clamps, hydraulic rams and articulated joints — no rivets, no wood, nothing that looks like a present-day trawler. It is old and hard-worked, never shiny: salt corrosion, biofouling, scarred coatings, repairs clamped over repairs. Orange hazard chevrons are the one thing humans never stopped painting. The tone is played completely straight: no jokes, no cute. Art direction stylised and chunky like R.E.P.O. and PEAK — low-poly geometry, flat shading, few colours, bold silhouettes that read from far away. Not photorealistic.</w:t>
             </w:r>
           </w:p>
           <w:p>
@@ -4412,7 +4412,7 @@
                 <w:color w:val="1B2430"/>
                 <w:sz w:val="17"/>
               </w:rPr>
-              <w:t>Design a single game asset: A SHIP MESS TABLE — 1.2 metres by 80 cm, 75 cm tall, a scratched steel top with a raised lip so mugs do not slide, a single heavy pedestal leg bolted to the floor, welds and rust at the base, ring stains on the top.</w:t>
+              <w:t>Design a single game asset: A MESS TABLE from a 2300 ship — 1.2 metres by 80 cm and 75 cm tall, a scratched composite top with a raised lip and recessed magnetic cup rings so nothing does slide, a single heavy pedestal on a magnetic deck plate, a thin amber strip round the rim, corrosion at the base and ring stains on the top.</w:t>
             </w:r>
           </w:p>
           <w:p>
@@ -4667,7 +4667,7 @@
                 <w:color w:val="5A6472"/>
                 <w:sz w:val="14"/>
               </w:rPr>
-              <w:t>Concept art for a low-poly co-op salvage horror game, year 2300, on an ocean world. Players are futuristic pirates — scavengers, not soldiers — sailing a battered salvage ship over a drowned human colony. The tone is played completely straight: no jokes, no cute. Art direction: stylised and chunky like R.E.P.O. and PEAK — low-poly geometry, flat shading, few colours, bold silhouettes that read from far away. Rusted steel, orange hazard paint, cold sea light. Not photorealistic.</w:t>
+              <w:t>Concept art for a low-poly co-op salvage horror game set in the year 2300, on an ocean world. Players are futuristic pirates — scavengers, not soldiers — crewing a deep-sea salvage ship over a drowned human colony. The technology is 2300, not today: layered composite armour panels with recessed seams and hex plating, ceramic and alloy, exposed conduit with thin cyan and amber light strips, magnetic clamps, hydraulic rams and articulated joints — no rivets, no wood, nothing that looks like a present-day trawler. It is old and hard-worked, never shiny: salt corrosion, biofouling, scarred coatings, repairs clamped over repairs. Orange hazard chevrons are the one thing humans never stopped painting. The tone is played completely straight: no jokes, no cute. Art direction stylised and chunky like R.E.P.O. and PEAK — low-poly geometry, flat shading, few colours, bold silhouettes that read from far away. Not photorealistic.</w:t>
             </w:r>
           </w:p>
           <w:p>
@@ -4692,7 +4692,7 @@
                 <w:color w:val="1B2430"/>
                 <w:sz w:val="17"/>
               </w:rPr>
-              <w:t>Design a single game asset: A SHIP NAME PLATE — a riveted steel plate 3 metres wide and 60 cm tall with the words BLACK TIDE SALVAGE raised in bold worn capitals, rust bleeding from the rivets, the paint half gone. Flat plate seen straight on, nothing else around it.</w:t>
+              <w:t>Design a single game asset: A SHIP NAME PLATE of the year 2300 — a composite plate 3 metres wide and 60 cm tall with the words BLACK TIDE SALVAGE recessed into the panel in bold worn capitals with a dead amber light channel behind them, corrosion bleeding from the fixings, the coating half gone. Flat plate seen straight on, nothing else around it.</w:t>
             </w:r>
           </w:p>
           <w:p>
@@ -4825,7 +4825,7 @@
                 <w:color w:val="5A6472"/>
                 <w:sz w:val="14"/>
               </w:rPr>
-              <w:t>Concept art for a low-poly co-op salvage horror game, year 2300, on an ocean world. Players are futuristic pirates — scavengers, not soldiers — sailing a battered salvage ship over a drowned human colony. The tone is played completely straight: no jokes, no cute. Art direction: stylised and chunky like R.E.P.O. and PEAK — low-poly geometry, flat shading, few colours, bold silhouettes that read from far away. Rusted steel, orange hazard paint, cold sea light. Not photorealistic.</w:t>
+              <w:t>Concept art for a low-poly co-op salvage horror game set in the year 2300, on an ocean world. Players are futuristic pirates — scavengers, not soldiers — crewing a deep-sea salvage ship over a drowned human colony. The technology is 2300, not today: layered composite armour panels with recessed seams and hex plating, ceramic and alloy, exposed conduit with thin cyan and amber light strips, magnetic clamps, hydraulic rams and articulated joints — no rivets, no wood, nothing that looks like a present-day trawler. It is old and hard-worked, never shiny: salt corrosion, biofouling, scarred coatings, repairs clamped over repairs. Orange hazard chevrons are the one thing humans never stopped painting. The tone is played completely straight: no jokes, no cute. Art direction stylised and chunky like R.E.P.O. and PEAK — low-poly geometry, flat shading, few colours, bold silhouettes that read from far away. Not photorealistic.</w:t>
             </w:r>
           </w:p>
           <w:p>
@@ -4850,7 +4850,7 @@
                 <w:color w:val="1B2430"/>
                 <w:sz w:val="17"/>
               </w:rPr>
-              <w:t>Design a single game asset: A SET OF THREE SMALL INDUSTRIAL HAZARD SIGNS, each about 60 cm by 40 cm, screwed to scuffed metal backing plates — one yellow triangle warning sign, one red circular prohibition sign, one blue instruction sign, all with simple symbols and no readable words. Scratched, faded, salt-stained. The three plates side by side.</w:t>
+              <w:t>Design a single game asset: A SET OF THREE HAZARD PLACARDS of the year 2300, each about 60 cm by 40 cm on scuffed composite backing panels — one amber triangle warning, one red circular prohibition, one cyan instruction, each symbol recessed into the panel with a faint light channel behind it, simple symbols and no readable words. Scratched, faded, salt-stained. The three side by side.</w:t>
             </w:r>
           </w:p>
           <w:p>
@@ -5105,7 +5105,7 @@
                 <w:color w:val="5A6472"/>
                 <w:sz w:val="14"/>
               </w:rPr>
-              <w:t>Concept art for a low-poly co-op salvage horror game, year 2300, on an ocean world. Players are futuristic pirates — scavengers, not soldiers — sailing a battered salvage ship over a drowned human colony. The tone is played completely straight: no jokes, no cute. Art direction: stylised and chunky like R.E.P.O. and PEAK — low-poly geometry, flat shading, few colours, bold silhouettes that read from far away. Rusted steel, orange hazard paint, cold sea light. Not photorealistic.</w:t>
+              <w:t>Concept art for a low-poly co-op salvage horror game set in the year 2300, on an ocean world. Players are futuristic pirates — scavengers, not soldiers — crewing a deep-sea salvage ship over a drowned human colony. The technology is 2300, not today: layered composite armour panels with recessed seams and hex plating, ceramic and alloy, exposed conduit with thin cyan and amber light strips, magnetic clamps, hydraulic rams and articulated joints — no rivets, no wood, nothing that looks like a present-day trawler. It is old and hard-worked, never shiny: salt corrosion, biofouling, scarred coatings, repairs clamped over repairs. Orange hazard chevrons are the one thing humans never stopped painting. The tone is played completely straight: no jokes, no cute. Art direction stylised and chunky like R.E.P.O. and PEAK — low-poly geometry, flat shading, few colours, bold silhouettes that read from far away. Not photorealistic.</w:t>
             </w:r>
           </w:p>
           <w:p>
@@ -5130,7 +5130,7 @@
                 <w:color w:val="1B2430"/>
                 <w:sz w:val="17"/>
               </w:rPr>
-              <w:t>Design a single game asset: THE STEEL FRAME OF A ROUND DEEP-SEA ELEVATOR CAR — 5 metres across and 3.5 metres tall: four heavy corner posts, a ribbed ring at the top and another at the bottom, curved bracing between them, bolted flanges, a caged lamp under the top ring, orange hazard paint worn off the edges. NO GLASS anywhere, NO FLOOR, and one side left as an open gap 2 metres wide for the doorway.</w:t>
+              <w:t>Design a single game asset: THE FRAME OF A ROUND DEEP-SEA ELEVATOR CAR of the year 2300 — 5 metres across and 3.5 metres tall: four heavy alloy posts, a ribbed pressure ring at the top and another at the bottom, curved bracing between them, clamp flanges, recessed cyan light strips up the posts, a ring of downlights under the top hoop and orange hazard chevrons worn off the edges. NO GLASS anywhere, NO FLOOR, and one side left as an open gap 2 metres wide for the doorway.</w:t>
             </w:r>
           </w:p>
           <w:p>
@@ -5263,7 +5263,7 @@
                 <w:color w:val="5A6472"/>
                 <w:sz w:val="14"/>
               </w:rPr>
-              <w:t>Concept art for a low-poly co-op salvage horror game, year 2300, on an ocean world. Players are futuristic pirates — scavengers, not soldiers — sailing a battered salvage ship over a drowned human colony. The tone is played completely straight: no jokes, no cute. Art direction: stylised and chunky like R.E.P.O. and PEAK — low-poly geometry, flat shading, few colours, bold silhouettes that read from far away. Rusted steel, orange hazard paint, cold sea light. Not photorealistic.</w:t>
+              <w:t>Concept art for a low-poly co-op salvage horror game set in the year 2300, on an ocean world. Players are futuristic pirates — scavengers, not soldiers — crewing a deep-sea salvage ship over a drowned human colony. The technology is 2300, not today: layered composite armour panels with recessed seams and hex plating, ceramic and alloy, exposed conduit with thin cyan and amber light strips, magnetic clamps, hydraulic rams and articulated joints — no rivets, no wood, nothing that looks like a present-day trawler. It is old and hard-worked, never shiny: salt corrosion, biofouling, scarred coatings, repairs clamped over repairs. Orange hazard chevrons are the one thing humans never stopped painting. The tone is played completely straight: no jokes, no cute. Art direction stylised and chunky like R.E.P.O. and PEAK — low-poly geometry, flat shading, few colours, bold silhouettes that read from far away. Not photorealistic.</w:t>
             </w:r>
           </w:p>
           <w:p>
@@ -5288,7 +5288,7 @@
                 <w:color w:val="1B2430"/>
                 <w:sz w:val="17"/>
               </w:rPr>
-              <w:t>Design a single game asset: A SMALL INDUSTRIAL CONTROL PANEL 60 cm wide, 40 cm tall and 8 cm deep — a rugged steel box with a sloped face, a protective lip, cable gland at the bottom, bolts at the corners, scuffed paint. The face inside the lip is completely flat, blank and dark, with no buttons and no lights on it.</w:t>
+              <w:t>Design a single game asset: A CONTROL PANEL of the year 2300, 60 cm wide, 40 cm tall and 8 cm deep — a sealed composite box with a sloped face, a raised protective lip with a thin cyan strip along it, a cable gland at the bottom, magnetic mounting pads at the corners, scuffed and salt-etched. The face inside the lip is completely flat, blank and dark, with no buttons and no lights on it.</w:t>
             </w:r>
           </w:p>
           <w:p>
@@ -5418,7 +5418,7 @@
                 <w:color w:val="5A6472"/>
                 <w:sz w:val="14"/>
               </w:rPr>
-              <w:t>Concept art for a low-poly co-op salvage horror game, year 2300, on an ocean world. Players are futuristic pirates — scavengers, not soldiers — sailing a battered salvage ship over a drowned human colony. The tone is played completely straight: no jokes, no cute. Art direction: stylised and chunky like R.E.P.O. and PEAK — low-poly geometry, flat shading, few colours, bold silhouettes that read from far away. Rusted steel, orange hazard paint, cold sea light. Not photorealistic.</w:t>
+              <w:t>Concept art for a low-poly co-op salvage horror game set in the year 2300, on an ocean world. Players are futuristic pirates — scavengers, not soldiers — crewing a deep-sea salvage ship over a drowned human colony. The technology is 2300, not today: layered composite armour panels with recessed seams and hex plating, ceramic and alloy, exposed conduit with thin cyan and amber light strips, magnetic clamps, hydraulic rams and articulated joints — no rivets, no wood, nothing that looks like a present-day trawler. It is old and hard-worked, never shiny: salt corrosion, biofouling, scarred coatings, repairs clamped over repairs. Orange hazard chevrons are the one thing humans never stopped painting. The tone is played completely straight: no jokes, no cute. Art direction stylised and chunky like R.E.P.O. and PEAK — low-poly geometry, flat shading, few colours, bold silhouettes that read from far away. Not photorealistic.</w:t>
             </w:r>
           </w:p>
           <w:p>
@@ -5443,7 +5443,7 @@
                 <w:color w:val="1B2430"/>
                 <w:sz w:val="17"/>
               </w:rPr>
-              <w:t>Design a single game asset: ONE SECTION OF A DEEP-SEA GLASS ELEVATOR TUBE — an open steel cage ring 5 metres across and 2 metres tall: two flanged hoops joined by six vertical ribs, bolt plates at every joint, a cable run and a caged lamp on one rib, heavy rust and worn orange paint. The top and bottom edges are flat and identical so sections stack seamlessly. Completely hollow — NO GLASS between the ribs, no floor, no walls.</w:t>
+              <w:t>Design a single game asset: ONE SECTION OF A DEEP-SEA ELEVATOR TUBE of the year 2300 — an open cage ring 5 metres across and 2 metres tall: two pressure hoops joined by six vertical ribs, clamp plates at every joint, a conduit run and a recessed cyan light strip up one rib, salt corrosion and worn orange chevrons. The top and bottom edges are flat and identical so sections stack seamlessly. Completely hollow — NO GLASS between the ribs, no floor, no walls.</w:t>
             </w:r>
           </w:p>
           <w:p>
@@ -5576,7 +5576,7 @@
                 <w:color w:val="5A6472"/>
                 <w:sz w:val="14"/>
               </w:rPr>
-              <w:t>Concept art for a low-poly co-op salvage horror game, year 2300, on an ocean world. Players are futuristic pirates — scavengers, not soldiers — sailing a battered salvage ship over a drowned human colony. The tone is played completely straight: no jokes, no cute. Art direction: stylised and chunky like R.E.P.O. and PEAK — low-poly geometry, flat shading, few colours, bold silhouettes that read from far away. Rusted steel, orange hazard paint, cold sea light. Not photorealistic.</w:t>
+              <w:t>Concept art for a low-poly co-op salvage horror game set in the year 2300, on an ocean world. Players are futuristic pirates — scavengers, not soldiers — crewing a deep-sea salvage ship over a drowned human colony. The technology is 2300, not today: layered composite armour panels with recessed seams and hex plating, ceramic and alloy, exposed conduit with thin cyan and amber light strips, magnetic clamps, hydraulic rams and articulated joints — no rivets, no wood, nothing that looks like a present-day trawler. It is old and hard-worked, never shiny: salt corrosion, biofouling, scarred coatings, repairs clamped over repairs. Orange hazard chevrons are the one thing humans never stopped painting. The tone is played completely straight: no jokes, no cute. Art direction stylised and chunky like R.E.P.O. and PEAK — low-poly geometry, flat shading, few colours, bold silhouettes that read from far away. Not photorealistic.</w:t>
             </w:r>
           </w:p>
           <w:p>
@@ -5601,7 +5601,7 @@
                 <w:color w:val="1B2430"/>
                 <w:sz w:val="17"/>
               </w:rPr>
-              <w:t>Design a single game asset: THE FOOT OF A DEEP-SEA ELEVATOR TUBE where it meets the sea floor — a wide braced steel base 7 metres across and 3 metres tall, splayed buttress legs bedded into silt, heavy flanges, barnacles and rust up to knee height, two caged lamps. ONE SIDE HAS AN OPEN DOORWAY 2 metres wide with no doors in it — leave that gap completely empty. Hollow inside.</w:t>
+              <w:t>Design a single game asset: THE FOOT OF A DEEP-SEA ELEVATOR TUBE of the year 2300, where it meets the sea floor — a wide braced base 7 metres across and 3 metres tall, splayed buttress legs on magnetic footplates bedded into silt, heavy pressure flanges, two downlight pods and cyan strips round the rim, biofouling and corrosion up to knee height. ONE SIDE HAS AN OPEN DOORWAY 2 metres wide with no doors in it — leave that gap completely empty. Hollow inside.</w:t>
             </w:r>
           </w:p>
           <w:p>
@@ -5856,7 +5856,7 @@
                 <w:color w:val="5A6472"/>
                 <w:sz w:val="14"/>
               </w:rPr>
-              <w:t>Concept art for a low-poly co-op salvage horror game, year 2300, on an ocean world. Players are futuristic pirates — scavengers, not soldiers — sailing a battered salvage ship over a drowned human colony. The tone is played completely straight: no jokes, no cute. Art direction: stylised and chunky like R.E.P.O. and PEAK — low-poly geometry, flat shading, few colours, bold silhouettes that read from far away. Rusted steel, orange hazard paint, cold sea light. Not photorealistic.</w:t>
+              <w:t>Concept art for a low-poly co-op salvage horror game set in the year 2300, on an ocean world. Players are futuristic pirates — scavengers, not soldiers — crewing a deep-sea salvage ship over a drowned human colony. The technology is 2300, not today: layered composite armour panels with recessed seams and hex plating, ceramic and alloy, exposed conduit with thin cyan and amber light strips, magnetic clamps, hydraulic rams and articulated joints — no rivets, no wood, nothing that looks like a present-day trawler. It is old and hard-worked, never shiny: salt corrosion, biofouling, scarred coatings, repairs clamped over repairs. Orange hazard chevrons are the one thing humans never stopped painting. The tone is played completely straight: no jokes, no cute. Art direction stylised and chunky like R.E.P.O. and PEAK — low-poly geometry, flat shading, few colours, bold silhouettes that read from far away. Not photorealistic.</w:t>
             </w:r>
           </w:p>
           <w:p>
@@ -5881,7 +5881,7 @@
                 <w:color w:val="1B2430"/>
                 <w:sz w:val="17"/>
               </w:rPr>
-              <w:t>A seamless tiling texture of a worn steel ship deck: diamond-plate tread pattern in wide panels, weld seams between plates, rust blooms, chipped grey paint, faint orange hazard stripe fragments, salt stains. Low-poly stylised game texture, flat colours, high contrast.</w:t>
+              <w:t>A seamless tiling texture of a worn 2300 ship deck: wide composite panels with recessed seams and a hexagonal anti-slip tread, thin inset light channels that are dead and grey, corrosion blooms at the joints, chipped coating, faint orange hazard chevron fragments, salt stains. Low-poly stylised game texture, flat colours, high contrast.</w:t>
             </w:r>
           </w:p>
           <w:p>
@@ -6014,7 +6014,7 @@
                 <w:color w:val="5A6472"/>
                 <w:sz w:val="14"/>
               </w:rPr>
-              <w:t>Concept art for a low-poly co-op salvage horror game, year 2300, on an ocean world. Players are futuristic pirates — scavengers, not soldiers — sailing a battered salvage ship over a drowned human colony. The tone is played completely straight: no jokes, no cute. Art direction: stylised and chunky like R.E.P.O. and PEAK — low-poly geometry, flat shading, few colours, bold silhouettes that read from far away. Rusted steel, orange hazard paint, cold sea light. Not photorealistic.</w:t>
+              <w:t>Concept art for a low-poly co-op salvage horror game set in the year 2300, on an ocean world. Players are futuristic pirates — scavengers, not soldiers — crewing a deep-sea salvage ship over a drowned human colony. The technology is 2300, not today: layered composite armour panels with recessed seams and hex plating, ceramic and alloy, exposed conduit with thin cyan and amber light strips, magnetic clamps, hydraulic rams and articulated joints — no rivets, no wood, nothing that looks like a present-day trawler. It is old and hard-worked, never shiny: salt corrosion, biofouling, scarred coatings, repairs clamped over repairs. Orange hazard chevrons are the one thing humans never stopped painting. The tone is played completely straight: no jokes, no cute. Art direction stylised and chunky like R.E.P.O. and PEAK — low-poly geometry, flat shading, few colours, bold silhouettes that read from far away. Not photorealistic.</w:t>
             </w:r>
           </w:p>
           <w:p>
@@ -6039,7 +6039,7 @@
                 <w:color w:val="1B2430"/>
                 <w:sz w:val="17"/>
               </w:rPr>
-              <w:t>A seamless tiling texture of riveted ship hull steel: large plates with rivet rows along the seams, deep rust streaks running downward, flaking dark paint over red primer, barnacle specks near the bottom. Low-poly stylised game texture, flat colours, high contrast.</w:t>
+              <w:t>A seamless tiling texture of 2300 composite hull armour: large panels with deep recessed seams and a faint hex weave, clamp studs along the joins, corrosion streaks running downward, flaking dark coating over pale composite, biofouling specks. Low-poly stylised game texture, flat colours, high contrast.</w:t>
             </w:r>
           </w:p>
           <w:p>
@@ -6089,7 +6089,7 @@
                 <w:color w:val="1B2430"/>
                 <w:sz w:val="19"/>
               </w:rPr>
-              <w:t>Rust and grime overlay</w:t>
+              <w:t>Corrosion and grime overlay</w:t>
             </w:r>
           </w:p>
           <w:p>
@@ -6169,7 +6169,7 @@
                 <w:color w:val="5A6472"/>
                 <w:sz w:val="14"/>
               </w:rPr>
-              <w:t>Concept art for a low-poly co-op salvage horror game, year 2300, on an ocean world. Players are futuristic pirates — scavengers, not soldiers — sailing a battered salvage ship over a drowned human colony. The tone is played completely straight: no jokes, no cute. Art direction: stylised and chunky like R.E.P.O. and PEAK — low-poly geometry, flat shading, few colours, bold silhouettes that read from far away. Rusted steel, orange hazard paint, cold sea light. Not photorealistic.</w:t>
+              <w:t>Concept art for a low-poly co-op salvage horror game set in the year 2300, on an ocean world. Players are futuristic pirates — scavengers, not soldiers — crewing a deep-sea salvage ship over a drowned human colony. The technology is 2300, not today: layered composite armour panels with recessed seams and hex plating, ceramic and alloy, exposed conduit with thin cyan and amber light strips, magnetic clamps, hydraulic rams and articulated joints — no rivets, no wood, nothing that looks like a present-day trawler. It is old and hard-worked, never shiny: salt corrosion, biofouling, scarred coatings, repairs clamped over repairs. Orange hazard chevrons are the one thing humans never stopped painting. The tone is played completely straight: no jokes, no cute. Art direction stylised and chunky like R.E.P.O. and PEAK — low-poly geometry, flat shading, few colours, bold silhouettes that read from far away. Not photorealistic.</w:t>
             </w:r>
           </w:p>
           <w:p>
@@ -6194,7 +6194,7 @@
                 <w:color w:val="1B2430"/>
                 <w:sz w:val="17"/>
               </w:rPr>
-              <w:t>A seamless tiling grunge overlay: rust patches, oil streaks, salt crust and scratches on a transparent-looking neutral grey background, no obvious shapes or edges, evenly spread so nothing stands out when it repeats.</w:t>
+              <w:t>A seamless tiling grunge overlay for 2300 composite panels: corrosion blooms, oil streaks, salt crust, micro-scratches and faint hex-weave wear on a flat neutral grey background, no obvious shapes or edges, evenly spread so nothing stands out when it repeats.</w:t>
             </w:r>
           </w:p>
           <w:p>

</xml_diff>

<commit_message>
docs: the hull is generated with a flat empty deck (an open-topped hull makes the generator invent a lid); the game's deck sits over it
Co-Authored-By: Claude Opus 5 <noreply@anthropic.com>
</commit_message>
<xml_diff>
--- a/docs/reference/Ship art - what to generate.docx
+++ b/docs/reference/Ship art - what to generate.docx
@@ -259,7 +259,7 @@
                 <w:color w:val="5A6472"/>
                 <w:sz w:val="14"/>
               </w:rPr>
-              <w:t>The outside shell below the deck. Flat open top — no deck surface and no interior.</w:t>
+              <w:t>The shell from the waterline up. Its flat top is covered by the game's own deck, so leave the deck empty — nothing standing on it.</w:t>
             </w:r>
           </w:p>
         </w:tc>
@@ -314,7 +314,7 @@
                 <w:color w:val="1B2430"/>
                 <w:sz w:val="17"/>
               </w:rPr>
-              <w:t>Design a single game asset: THE HULL of a 2300 deep-sea salvage ship, seen from outside — about 44 metres long, 16 metres wide and 7 metres deep. Layered composite armour panels with deep recessed seams, a blunt reinforced bow with a sonar bulb, sealed intake grilles, thin cyan light strips recessed along the waterline, magnetic clamp plates on the flanks, salt corrosion and biofouling low down, patch panels clamped over old damage. The top is completely open and flat: no deck surface, no railings, no superstructure, no interior — only the hull shell.</w:t>
+              <w:t>Design a single game asset: THE HULL of a 2300 deep-sea salvage ship, seen from outside — about 44 metres long, 16 metres wide and 7 metres deep. Layered composite armour panels with deep recessed seams, a blunt reinforced bow with a sonar bulb, sealed intake grilles, thin cyan light strips recessed along the waterline, magnetic clamp plates on the flanks, salt corrosion and biofouling low down, patch panels clamped over old damage. The top is closed by a completely FLAT, EMPTY deck surface running the full length — no railings, no superstructure, no crane, no containers, no hatches standing proud, nothing on the deck at all, and no interior below.</w:t>
             </w:r>
           </w:p>
           <w:p>

</xml_diff>

<commit_message>
docs: the hull's deck is recessed 1 m below the top edge so the sides form a bulwark nobody can fall over (Dan)
Co-Authored-By: Claude Opus 5 <noreply@anthropic.com>
</commit_message>
<xml_diff>
--- a/docs/reference/Ship art - what to generate.docx
+++ b/docs/reference/Ship art - what to generate.docx
@@ -259,7 +259,7 @@
                 <w:color w:val="5A6472"/>
                 <w:sz w:val="14"/>
               </w:rPr>
-              <w:t>The shell from the waterline up. Its flat top is covered by the game's own deck, so leave the deck empty — nothing standing on it.</w:t>
+              <w:t>The shell from the waterline up. The deck is recessed 1 m below the hull's top edge so the sides form a bulwark and nobody falls off; the game lays its own deck inside that tray. Leave the deck empty.</w:t>
             </w:r>
           </w:p>
         </w:tc>
@@ -314,7 +314,7 @@
                 <w:color w:val="1B2430"/>
                 <w:sz w:val="17"/>
               </w:rPr>
-              <w:t>Design a single game asset: THE HULL of a 2300 deep-sea salvage ship, seen from outside — about 44 metres long, 16 metres wide and 7 metres deep. Layered composite armour panels with deep recessed seams, a blunt reinforced bow with a sonar bulb, sealed intake grilles, thin cyan light strips recessed along the waterline, magnetic clamp plates on the flanks, salt corrosion and biofouling low down, patch panels clamped over old damage. The top is closed by a completely FLAT, EMPTY deck surface running the full length — no railings, no superstructure, no crane, no containers, no hatches standing proud, nothing on the deck at all, and no interior below.</w:t>
+              <w:t>Design a single game asset: THE HULL of a 2300 deep-sea salvage ship, seen from outside — about 44 metres long, 16 metres wide and 7 metres deep. Layered composite armour panels with deep recessed seams, a blunt reinforced bow with a sonar bulb, sealed intake grilles, thin cyan light strips recessed along the waterline, magnetic clamp plates on the flanks, salt corrosion and biofouling low down, patch panels clamped over old damage. The top is closed by a completely FLAT, EMPTY deck surface running the full length, and that deck sits about 1 metre BELOW the top edge of the hull: the side walls carry on upward past it as a solid unbroken bulwark all the way round, so the deck is a shallow tray nobody can step off. Nothing stands on the deck at all — no railings, no superstructure, no crane, no containers, no hatches — and there is no interior below.</w:t>
             </w:r>
           </w:p>
           <w:p>
@@ -572,7 +572,7 @@
                 <w:color w:val="5A6472"/>
                 <w:sz w:val="14"/>
               </w:rPr>
-              <w:t>One section, repeated all round the deck — both ends must be flat and identical so they line up.</w:t>
+              <w:t>Stands on top of the hull's bulwark, repeated all round the deck — both ends must be flat and identical so they line up.</w:t>
             </w:r>
           </w:p>
         </w:tc>

</xml_diff>

<commit_message>
docs: the cabin housing is glass — clear panels between the ribs, no opaque walls (Dan)
Co-Authored-By: Claude Opus 5 <noreply@anthropic.com>
</commit_message>
<xml_diff>
--- a/docs/reference/Ship art - what to generate.docx
+++ b/docs/reference/Ship art - what to generate.docx
@@ -885,7 +885,7 @@
                 <w:color w:val="5A6472"/>
                 <w:sz w:val="14"/>
               </w:rPr>
-              <w:t>The round housing round the shaft on deck. Doors and glass are built in the game — leave the doorway empty.</w:t>
+              <w:t>The round glass housing round the shaft on deck. Every panel between the ribs is clear glass; the doors are built in the game, so leave the doorway an empty gap.</w:t>
             </w:r>
           </w:p>
         </w:tc>
@@ -940,7 +940,7 @@
                 <w:color w:val="1B2430"/>
                 <w:sz w:val="17"/>
               </w:rPr>
-              <w:t>Design a single game asset: THE HOUSING of a deep-sea elevator shaft on a 2300 ship deck — a cylinder 5 metres across and 3 metres high, ribbed with vertical alloy frames over composite panels, heavy pressure flanges top and bottom, hydraulic rams flanking the opening, cyan light strips down the ribs, orange hazard chevrons round the base and an amber beacon over the opening. ONE SIDE HAS AN OPEN DOORWAY 2 metres wide with no doors in it — leave that gap completely empty.</w:t>
+              <w:t>Design a single game asset: THE GLASS HOUSING of a deep-sea elevator shaft on a 2300 ship deck — a cylinder 5 metres across and 3 metres high. It is a skeleton of vertical alloy ribs with 100% CLEAR TRANSPARENT GLASS between them: every panel is fully see-through, so the shaft and the machinery inside are plainly visible straight through the whole cylinder, and so is the background behind it. No opaque walls anywhere — the only solid parts are the thin ribs, heavy pressure flanges top and bottom, hydraulic rams flanking the opening, cyan light strips down the ribs, orange hazard chevrons round the base ring and an amber beacon over the opening. The glass is scratched and salt-hazed at the edges but clear in the middle. ONE SIDE HAS AN OPEN DOORWAY 2 metres wide with no doors and no glass in it — leave that gap completely empty.</w:t>
             </w:r>
           </w:p>
           <w:p>

</xml_diff>

<commit_message>
docs: the deck screen is 3.6 x 2.1 m on two posts, thin bezel, one clean blank face (Dan: bigger and good to watch)
Co-Authored-By: Claude Opus 5 <noreply@anthropic.com>
</commit_message>
<xml_diff>
--- a/docs/reference/Ship art - what to generate.docx
+++ b/docs/reference/Ship art - what to generate.docx
@@ -1776,7 +1776,7 @@
                 <w:color w:val="1B2430"/>
                 <w:sz w:val="18"/>
               </w:rPr>
-              <w:t>2.2 m wide × 1.4 m high × 0.12 m deep, on a 1 m post</w:t>
+              <w:t>3.6 m wide × 2.1 m high, on two 1.2 m posts</w:t>
             </w:r>
           </w:p>
           <w:p>
@@ -1791,7 +1791,7 @@
                 <w:color w:val="5A6472"/>
                 <w:sz w:val="14"/>
               </w:rPr>
-              <w:t>The frame only — the picture is drawn by the game, so its face must stay flat, blank and dark.</w:t>
+              <w:t>Big enough to watch a dive from across the deck. The frame only — the picture is drawn by the game, so the face must stay one clean flat blank rectangle.</w:t>
             </w:r>
           </w:p>
         </w:tc>
@@ -1846,7 +1846,7 @@
                 <w:color w:val="1B2430"/>
                 <w:sz w:val="17"/>
               </w:rPr>
-              <w:t>Design a single game asset: AN OUTDOOR DISPLAY CABINET for a 2300 ship deck — a wide armoured bezel 2.2 metres across and 1.4 metres high on a single squared post 1 metre tall, with a sealed hood over the top, cable conduit down the post, a thin cyan light strip along its lower edge and pressure seals round the frame. Composite over alloy, salt-etched. The screen area inside the frame is completely flat, blank and dark — no picture and no reflection.</w:t>
+              <w:t>Design a single game asset: A LARGE OUTDOOR VIEWING SCREEN for a 2300 ship deck — a wide 16:9 display 3.6 metres across and 2.1 metres high, mounted on two squared posts 1.2 metres tall so it stands at head height. The bezel is thin and tight so the screen fills almost the whole front — a slim armoured rim with pressure seals, a narrow sealed hood along the top edge, cable conduit down both posts, a thin cyan light strip under the bottom rim and small mounting brackets at the corners. Composite over alloy, salt-etched, corrosion at the fixings. The screen itself is a single perfectly flat, smooth, blank matte-black panel — no picture, no reflection, no glare, no scan lines, no pixel grid, no cracks, no text — the whole front is one clean unbroken rectangle.</w:t>
             </w:r>
           </w:p>
           <w:p>

</xml_diff>

<commit_message>
docs: every prompt ends with its exact size, so a copied [B] carries it (Dan); the size column is now only a quick reference
Co-Authored-By: Claude Opus 5 <noreply@anthropic.com>
</commit_message>
<xml_diff>
--- a/docs/reference/Ship art - what to generate.docx
+++ b/docs/reference/Ship art - what to generate.docx
@@ -62,7 +62,7 @@
           <w:color w:val="5A6472"/>
           <w:sz w:val="18"/>
         </w:rPr>
-        <w:t>Every prompt is in three blocks. [A] is the game's look and never changes. [B] is the part itself. [C] is the framing rule and never changes. Paste all three as one message.</w:t>
+        <w:t>Every prompt is in three blocks. [A] is the game's look and never changes. [B] is the part itself and ends with its exact size, so a copied prompt carries everything it needs. [C] is the framing rule and never changes. Paste all three as one message — the size column beside it is only a quick reference.</w:t>
       </w:r>
     </w:p>
     <w:p>
@@ -184,7 +184,7 @@
                 <w:color w:val="FFFFFF"/>
                 <w:sz w:val="19"/>
               </w:rPr>
-              <w:t>Prompt — paste blocks A + B + C together</w:t>
+              <w:t>Prompt — paste blocks A + B + C together (the size is inside [B])</w:t>
             </w:r>
           </w:p>
         </w:tc>
@@ -314,7 +314,7 @@
                 <w:color w:val="1B2430"/>
                 <w:sz w:val="17"/>
               </w:rPr>
-              <w:t>Design a single game asset: THE HULL of a 2300 deep-sea salvage ship, seen from outside — about 44 metres long, 16 metres wide and 7 metres deep. Layered composite armour panels with deep recessed seams, a blunt reinforced bow with a sonar bulb, sealed intake grilles, thin cyan light strips recessed along the waterline, magnetic clamp plates on the flanks, salt corrosion and biofouling low down, patch panels clamped over old damage. The top is closed by a completely FLAT, EMPTY deck surface running the full length, and that deck sits about 1 metre BELOW the top edge of the hull: the side walls carry on upward past it as a solid unbroken bulwark all the way round, so the deck is a shallow tray nobody can step off. Nothing stands on the deck at all — no railings, no superstructure, no crane, no containers, no hatches — and there is no interior below.</w:t>
+              <w:t>Design a single game asset: THE HULL of a 2300 deep-sea salvage ship, seen from outside — about 44 metres long, 16 metres wide and 7 metres deep. Layered composite armour panels with deep recessed seams, a blunt reinforced bow with a sonar bulb, sealed intake grilles, thin cyan light strips recessed along the waterline, magnetic clamp plates on the flanks, salt corrosion and biofouling low down, patch panels clamped over old damage. The top is closed by a completely FLAT, EMPTY deck surface running the full length, and that deck sits about 1 metre BELOW the top edge of the hull: the side walls carry on upward past it as a solid unbroken bulwark all the way round, so the deck is a shallow tray nobody can step off. Nothing stands on the deck at all — no railings, no superstructure, no crane, no containers, no hatches — and there is no interior below. EXACT SIZE IN THE GAME: 44 m long × 16 m wide × 7 m deep — draw it at exactly those proportions.</w:t>
             </w:r>
           </w:p>
           <w:p>
@@ -472,7 +472,7 @@
                 <w:color w:val="1B2430"/>
                 <w:sz w:val="17"/>
               </w:rPr>
-              <w:t>Design a single game asset: THE BRIDGE TOWER of a 2300 salvage ship — a hard-surface composite superstructure 8 metres wide, 6 metres deep and 6 metres high, with a completely FLAT empty roof because a walkway lands on it. One wide wrap-around armoured viewport with a dark tinted band, a sealed pressure hatch on one side, recessed rungs, a slim railing round the roof edge, a folded sensor array and a phased-array dish on top, cyan light strips tracing the panel seams and orange hazard chevrons at the base. Outside shell only — no interior and no floors inside.</w:t>
+              <w:t>Design a single game asset: THE BRIDGE TOWER of a 2300 salvage ship — a hard-surface composite superstructure 8 metres wide, 6 metres deep and 6 metres high, with a completely FLAT empty roof because a walkway lands on it. One wide wrap-around armoured viewport with a dark tinted band, a sealed pressure hatch on one side, recessed rungs, a slim railing round the roof edge, a folded sensor array and a phased-array dish on top, cyan light strips tracing the panel seams and orange hazard chevrons at the base. Outside shell only — no interior and no floors inside. EXACT SIZE IN THE GAME: 8 m wide × 6 m deep × 6 m high — draw it at exactly those proportions.</w:t>
             </w:r>
           </w:p>
           <w:p>
@@ -627,7 +627,7 @@
                 <w:color w:val="1B2430"/>
                 <w:sz w:val="17"/>
               </w:rPr>
-              <w:t>Design a single game asset: A DECK RAILING SECTION of a 2300 ship, exactly 2 metres long and 1.2 metres high — two squared alloy stanchions at the ends, a thick top rail, a taut cable run instead of a middle bar, and a solid composite kick plate along the bottom in orange and black hazard chevrons with a thin amber light strip above it. Scuffed and salt-etched, chunky and simple. Both ends are flat and identical so many sections join in a straight line.</w:t>
+              <w:t>Design a single game asset: A DECK RAILING SECTION of a 2300 ship, exactly 2 metres long and 1.2 metres high — two squared alloy stanchions at the ends, a thick top rail, a taut cable run instead of a middle bar, and a solid composite kick plate along the bottom in orange and black hazard chevrons with a thin amber light strip above it. Scuffed and salt-etched, chunky and simple. Both ends are flat and identical so many sections join in a straight line. EXACT SIZE IN THE GAME: 2 m long × 1.2 m high × 0.2 m thick — draw it at exactly those proportions.</w:t>
             </w:r>
           </w:p>
           <w:p>
@@ -785,7 +785,7 @@
                 <w:color w:val="1B2430"/>
                 <w:sz w:val="17"/>
               </w:rPr>
-              <w:t>Design a single game asset: A SMALL CARGO MODULE for a 2300 ship deck — 2.8 metres wide, 3 metres deep and 2.2 metres high, composite panel walls with recessed seams and a ribbed flat roof, magnetic deck clamps at the corners, a cyan light strip over the entrance, orange hazard chevrons round the base and corrosion staining at the joints. ONE WALL HAS AN OPEN DOORWAY 1.4 metres wide and full height with NO DOOR IN IT — leave that gap completely empty. No floor inside, no interior fittings.</w:t>
+              <w:t>Design a single game asset: A SMALL CARGO MODULE for a 2300 ship deck — 2.8 metres wide, 3 metres deep and 2.2 metres high, composite panel walls with recessed seams and a ribbed flat roof, magnetic deck clamps at the corners, a cyan light strip over the entrance, orange hazard chevrons round the base and corrosion staining at the joints. ONE WALL HAS AN OPEN DOORWAY 1.4 metres wide and full height with NO DOOR IN IT — leave that gap completely empty. No floor inside, no interior fittings. EXACT SIZE IN THE GAME: 2.8 m wide × 3.0 m deep × 2.2 m high, doorway 1.4 m — draw it at exactly those proportions.</w:t>
             </w:r>
           </w:p>
           <w:p>
@@ -940,7 +940,7 @@
                 <w:color w:val="1B2430"/>
                 <w:sz w:val="17"/>
               </w:rPr>
-              <w:t>Design a single game asset: THE GLASS HOUSING of a deep-sea elevator shaft on a 2300 ship deck — a cylinder 5 metres across and 3 metres high. It is a skeleton of vertical alloy ribs with 100% CLEAR TRANSPARENT GLASS between them: every panel is fully see-through, so the shaft and the machinery inside are plainly visible straight through the whole cylinder, and so is the background behind it. No opaque walls anywhere — the only solid parts are the thin ribs, heavy pressure flanges top and bottom, hydraulic rams flanking the opening, cyan light strips down the ribs, orange hazard chevrons round the base ring and an amber beacon over the opening. The glass is scratched and salt-hazed at the edges but clear in the middle. ONE SIDE HAS AN OPEN DOORWAY 2 metres wide with no doors and no glass in it — leave that gap completely empty.</w:t>
+              <w:t>Design a single game asset: THE GLASS HOUSING of a deep-sea elevator shaft on a 2300 ship deck — a cylinder 5 metres across and 3 metres high. It is a skeleton of vertical alloy ribs with 100% CLEAR TRANSPARENT GLASS between them: every panel is fully see-through, so the shaft and the machinery inside are plainly visible straight through the whole cylinder, and so is the background behind it. No opaque walls anywhere — the only solid parts are the thin ribs, heavy pressure flanges top and bottom, hydraulic rams flanking the opening, cyan light strips down the ribs, orange hazard chevrons round the base ring and an amber beacon over the opening. The glass is scratched and salt-hazed at the edges but clear in the middle. ONE SIDE HAS AN OPEN DOORWAY 2 metres wide with no doors and no glass in it — leave that gap completely empty. EXACT SIZE IN THE GAME: 5 m across × 3 m high, doorway 2 m — draw it at exactly those proportions.</w:t>
             </w:r>
           </w:p>
           <w:p>
@@ -1090,7 +1090,7 @@
                 <w:color w:val="FFFFFF"/>
                 <w:sz w:val="19"/>
               </w:rPr>
-              <w:t>Prompt — paste blocks A + B + C together</w:t>
+              <w:t>Prompt — paste blocks A + B + C together (the size is inside [B])</w:t>
             </w:r>
           </w:p>
         </w:tc>
@@ -1220,7 +1220,7 @@
                 <w:color w:val="1B2430"/>
                 <w:sz w:val="17"/>
               </w:rPr>
-              <w:t>Design a single game asset: A SALVAGE CRANE of the year 2300 — a squat armoured base 2.2 metres across on a slewing ring, a small sealed operator pod with one dark curved viewport, a boxed alloy mast 7 metres tall with hydraulic rams along it, and a straight telescopic boom 9 metres long reaching out to one side with a cable and a magnetic grapple head. Composite panels over a visible frame, cyan light strips on the mast, orange hazard chevrons on the boom tip and a red beacon at the top. Worn, salt-etched, hard-worked.</w:t>
+              <w:t>Design a single game asset: A SALVAGE CRANE of the year 2300 — a squat armoured base 2.2 metres across on a slewing ring, a small sealed operator pod with one dark curved viewport, a boxed alloy mast 7 metres tall with hydraulic rams along it, and a straight telescopic boom 9 metres long reaching out to one side with a cable and a magnetic grapple head. Composite panels over a visible frame, cyan light strips on the mast, orange hazard chevrons on the boom tip and a red beacon at the top. Worn, salt-etched, hard-worked. EXACT SIZE IN THE GAME: 2.2 m base and 7 m mast and 9 m boom — draw it at exactly those proportions.</w:t>
             </w:r>
           </w:p>
           <w:p>
@@ -1378,7 +1378,7 @@
                 <w:color w:val="1B2430"/>
                 <w:sz w:val="17"/>
               </w:rPr>
-              <w:t>Design a single game asset: A HEAVY DECK WINCH of the year 2300 — a horizontal drum about 1.4 metres across wound with braided filament cable, held in a low armoured cradle about 2 metres wide, with a sealed drive housing on one side, a hydraulic brake caliper and a small dark status panel. Composite over alloy, an amber light strip along the cradle, oil stains, salt corrosion and orange hazard chevrons on the edges.</w:t>
+              <w:t>Design a single game asset: A HEAVY DECK WINCH of the year 2300 — a horizontal drum about 1.4 metres across wound with braided filament cable, held in a low armoured cradle about 2 metres wide, with a sealed drive housing on one side, a hydraulic brake caliper and a small dark status panel. Composite over alloy, an amber light strip along the cradle, oil stains, salt corrosion and orange hazard chevrons on the edges. EXACT SIZE IN THE GAME: 2 m wide × 1.2 m deep × 1.6 m high (drum 1.4 m across) — draw it at exactly those proportions.</w:t>
             </w:r>
           </w:p>
           <w:p>
@@ -1533,7 +1533,7 @@
                 <w:color w:val="1B2430"/>
                 <w:sz w:val="17"/>
               </w:rPr>
-              <w:t>Design a single game asset: A CARGO POD of the year 2300, 6 metres long, 2.6 metres wide and 2.6 metres high — smooth composite panels with recessed seams and a hex-pattern band, heavy magnetic corner clamps, a reinforced frame at each end, one sealed hatch with a hydraulic locking ring, a dark inert status strip beside it, dents and corrosion runs. Painted one flat colour scraped through to grey composite at the edges. Plain and boxy, with no logos and no text.</w:t>
+              <w:t>Design a single game asset: A CARGO POD of the year 2300, 6 metres long, 2.6 metres wide and 2.6 metres high — smooth composite panels with recessed seams and a hex-pattern band, heavy magnetic corner clamps, a reinforced frame at each end, one sealed hatch with a hydraulic locking ring, a dark inert status strip beside it, dents and corrosion runs. Painted one flat colour scraped through to grey composite at the edges. Plain and boxy, with no logos and no text. EXACT SIZE IN THE GAME: 6 m long × 2.6 m wide × 2.6 m high — draw it at exactly those proportions.</w:t>
             </w:r>
           </w:p>
           <w:p>
@@ -1691,7 +1691,7 @@
                 <w:color w:val="1B2430"/>
                 <w:sz w:val="17"/>
               </w:rPr>
-              <w:t>Design a single game asset: A SHIP BRIDGE CONSOLE of the year 2300 — a composite desk 1.8 metres wide and 1 metre high with a sloped face, cable conduit and cooling fins underneath, and a large armoured display bezel 1.8 metres wide and 1.2 metres high standing above it on two struts. Recessed seams, a cyan light strip under the lip, a hazard chevron along the base and empty recessed sockets where buttons will go. The screen inside the bezel is completely flat, blank and dark.</w:t>
+              <w:t>Design a single game asset: A SHIP BRIDGE CONSOLE of the year 2300 — a composite desk 1.8 metres wide and 1 metre high with a sloped face, cable conduit and cooling fins underneath, and a large armoured display bezel 1.8 metres wide and 1.2 metres high standing above it on two struts. Recessed seams, a cyan light strip under the lip, a hazard chevron along the base and empty recessed sockets where buttons will go. The screen inside the bezel is completely flat, blank and dark. EXACT SIZE IN THE GAME: 1.8 m wide × 0.5 m deep × 1.0 m high, screen 1.8 × 1.2 m — draw it at exactly those proportions.</w:t>
             </w:r>
           </w:p>
           <w:p>
@@ -1846,7 +1846,7 @@
                 <w:color w:val="1B2430"/>
                 <w:sz w:val="17"/>
               </w:rPr>
-              <w:t>Design a single game asset: A LARGE OUTDOOR VIEWING SCREEN for a 2300 ship deck — a wide 16:9 display 3.6 metres across and 2.1 metres high, mounted on two squared posts 1.2 metres tall so it stands at head height. The bezel is thin and tight so the screen fills almost the whole front — a slim armoured rim with pressure seals, a narrow sealed hood along the top edge, cable conduit down both posts, a thin cyan light strip under the bottom rim and small mounting brackets at the corners. Composite over alloy, salt-etched, corrosion at the fixings. The screen itself is a single perfectly flat, smooth, blank matte-black panel — no picture, no reflection, no glare, no scan lines, no pixel grid, no cracks, no text — the whole front is one clean unbroken rectangle.</w:t>
+              <w:t>Design a single game asset: A LARGE OUTDOOR VIEWING SCREEN for a 2300 ship deck — a wide 16:9 display 3.6 metres across and 2.1 metres high, mounted on two squared posts 1.2 metres tall so it stands at head height. The bezel is thin and tight so the screen fills almost the whole front — a slim armoured rim with pressure seals, a narrow sealed hood along the top edge, cable conduit down both posts, a thin cyan light strip under the bottom rim and small mounting brackets at the corners. Composite over alloy, salt-etched, corrosion at the fixings. The screen itself is a single perfectly flat, smooth, blank matte-black panel — no picture, no reflection, no glare, no scan lines, no pixel grid, no cracks, no text — the whole front is one clean unbroken rectangle. EXACT SIZE IN THE GAME: 3.6 m wide × 2.1 m high, on two 1.2 m posts — draw it at exactly those proportions.</w:t>
             </w:r>
           </w:p>
           <w:p>
@@ -2004,7 +2004,7 @@
                 <w:color w:val="1B2430"/>
                 <w:sz w:val="17"/>
               </w:rPr>
-              <w:t>Design a single game asset: A DECK FLOODLIGHT of the year 2300 on a short squared post 1.35 metres tall, with a boxy sealed head about 0.5 metres across under a flat hood, a recessed amber panel lens behind a slim guard, cooling fins at the back, a magnetic base plate and conduit running down the post. Composite and alloy, salt-etched, industrial, simple.</w:t>
+              <w:t>Design a single game asset: A DECK FLOODLIGHT of the year 2300 on a short squared post 1.35 metres tall, with a boxy sealed head about 0.5 metres across under a flat hood, a recessed amber panel lens behind a slim guard, cooling fins at the back, a magnetic base plate and conduit running down the post. Composite and alloy, salt-etched, industrial, simple. EXACT SIZE IN THE GAME: 0.5 m head on a 1.35 m post — draw it at exactly those proportions.</w:t>
             </w:r>
           </w:p>
           <w:p>
@@ -2154,7 +2154,7 @@
                 <w:color w:val="FFFFFF"/>
                 <w:sz w:val="19"/>
               </w:rPr>
-              <w:t>Prompt — paste blocks A + B + C together</w:t>
+              <w:t>Prompt — paste blocks A + B + C together (the size is inside [B])</w:t>
             </w:r>
           </w:p>
         </w:tc>
@@ -2284,7 +2284,7 @@
                 <w:color w:val="1B2430"/>
                 <w:sz w:val="17"/>
               </w:rPr>
-              <w:t>Design a single game asset: ONE LEAF of a pressure door for a 2300 deep-sea elevator — 1 metre wide, 2.6 metres tall and 10 cm thick, gently curved as if it belongs to a round cabin: a composite face with recessed seams, a narrow armoured viewing slit at head height, interlocking teeth down the closing edge, a pressure seal, a cyan light strip and orange hazard chevrons. One leaf standing upright on its own — not a pair, not a frame.</w:t>
+              <w:t>Design a single game asset: ONE LEAF of a pressure door for a 2300 deep-sea elevator — 1 metre wide, 2.6 metres tall and 10 cm thick, gently curved as if it belongs to a round cabin: a composite face with recessed seams, a narrow armoured viewing slit at head height, interlocking teeth down the closing edge, a pressure seal, a cyan light strip and orange hazard chevrons. One leaf standing upright on its own — not a pair, not a frame. EXACT SIZE IN THE GAME: 1 m wide × 2.6 m high × 0.1 m thick — draw it at exactly those proportions.</w:t>
             </w:r>
           </w:p>
           <w:p>
@@ -2442,7 +2442,7 @@
                 <w:color w:val="1B2430"/>
                 <w:sz w:val="17"/>
               </w:rPr>
-              <w:t>Design a single game asset: A LOW THRESHOLD PLATE for a 2300 ship doorway — 1.4 metres wide and 12 cm high, a ridged composite step with a recessed drain channel and a thin amber strip along its front edge, painted in orange hazard chevrons worn through to grey where boots cross, with magnetic fixings at both ends.</w:t>
+              <w:t>Design a single game asset: A LOW THRESHOLD PLATE for a 2300 ship doorway — 1.4 metres wide and 12 cm high, a ridged composite step with a recessed drain channel and a thin amber strip along its front edge, painted in orange hazard chevrons worn through to grey where boots cross, with magnetic fixings at both ends. EXACT SIZE IN THE GAME: 1.4 m wide × 0.12 m high — draw it at exactly those proportions.</w:t>
             </w:r>
           </w:p>
           <w:p>
@@ -2592,7 +2592,7 @@
                 <w:color w:val="FFFFFF"/>
                 <w:sz w:val="19"/>
               </w:rPr>
-              <w:t>Prompt — paste blocks A + B + C together</w:t>
+              <w:t>Prompt — paste blocks A + B + C together (the size is inside [B])</w:t>
             </w:r>
           </w:p>
         </w:tc>
@@ -2722,7 +2722,7 @@
                 <w:color w:val="1B2430"/>
                 <w:sz w:val="17"/>
               </w:rPr>
-              <w:t>Design a single game asset: A MOORING CLEAT of the year 2300 for a ship deck — a stout alloy post 40 cm across and 60 cm tall with a flared magnetic cap and a recessed base ring carrying a thin amber indicator strip, braided filament line worn shiny into the neck, salt corrosion and chipped orange hazard paint.</w:t>
+              <w:t>Design a single game asset: A MOORING CLEAT of the year 2300 for a ship deck — a stout alloy post 40 cm across and 60 cm tall with a flared magnetic cap and a recessed base ring carrying a thin amber indicator strip, braided filament line worn shiny into the neck, salt corrosion and chipped orange hazard paint. EXACT SIZE IN THE GAME: 0.4 × 0.4 × 0.6 m — draw it at exactly those proportions.</w:t>
             </w:r>
           </w:p>
           <w:p>
@@ -2880,7 +2880,7 @@
                 <w:color w:val="1B2430"/>
                 <w:sz w:val="17"/>
               </w:rPr>
-              <w:t>Design a single game asset: A CLUSTER OF CONDUIT AND HEAT EXCHANGERS from a 2300 ship — a group 2 metres wide and 1.5 metres tall running along a wall: sealed conduit runs with clamp collars and elbow bends, two finned exchanger blocks, a coolant reservoir with a dark gauge panel, a cyan light strip tracing one run and orange hazard chevrons on an isolation valve. Corroded at the joints, cracked lagging. Free-standing group, no wall behind it.</w:t>
+              <w:t>Design a single game asset: A CLUSTER OF CONDUIT AND HEAT EXCHANGERS from a 2300 ship — a group 2 metres wide and 1.5 metres tall running along a wall: sealed conduit runs with clamp collars and elbow bends, two finned exchanger blocks, a coolant reservoir with a dark gauge panel, a cyan light strip tracing one run and orange hazard chevrons on an isolation valve. Corroded at the joints, cracked lagging. Free-standing group, no wall behind it. EXACT SIZE IN THE GAME: 2 m wide × 0.6 m deep × 1.5 m high — draw it at exactly those proportions.</w:t>
             </w:r>
           </w:p>
           <w:p>
@@ -3035,7 +3035,7 @@
                 <w:color w:val="1B2430"/>
                 <w:sz w:val="17"/>
               </w:rPr>
-              <w:t>Design a single game asset: A WALL LADDER of the year 2300, 50 cm wide and 3 metres tall — two flat alloy side rails with recessed grip rungs, magnetic stand-off brackets at top and bottom, a thin amber strip up one rail, salt corrosion and worn orange paint on the top rung. Free-standing, no wall behind it.</w:t>
+              <w:t>Design a single game asset: A WALL LADDER of the year 2300, 50 cm wide and 3 metres tall — two flat alloy side rails with recessed grip rungs, magnetic stand-off brackets at top and bottom, a thin amber strip up one rail, salt corrosion and worn orange paint on the top rung. Free-standing, no wall behind it. EXACT SIZE IN THE GAME: 0.5 m wide × 3 m high — draw it at exactly those proportions.</w:t>
             </w:r>
           </w:p>
           <w:p>
@@ -3193,7 +3193,7 @@
                 <w:color w:val="1B2430"/>
                 <w:sz w:val="17"/>
               </w:rPr>
-              <w:t>Design a single game asset: A PRESSURE CANISTER of the year 2300, 60 cm across and 90 cm tall — a ribbed composite body with a banded alloy collar, a recessed valve head under a guard, a dark inert level strip down one side, dents and corrosion round the base and one faded orange hazard band. Plain, no readable text.</w:t>
+              <w:t>Design a single game asset: A PRESSURE CANISTER of the year 2300, 60 cm across and 90 cm tall — a ribbed composite body with a banded alloy collar, a recessed valve head under a guard, a dark inert level strip down one side, dents and corrosion round the base and one faded orange hazard band. Plain, no readable text. EXACT SIZE IN THE GAME: 0.6 m across × 0.9 m high — draw it at exactly those proportions.</w:t>
             </w:r>
           </w:p>
           <w:p>
@@ -3348,7 +3348,7 @@
                 <w:color w:val="1B2430"/>
                 <w:sz w:val="17"/>
               </w:rPr>
-              <w:t>Design a single game asset: A SALVAGE CASE of the year 2300, 80 cm long, 60 cm wide and 60 cm tall — a moulded composite shell with recessed seams and reinforced corners, scuffed panels, two heavy over-centre latches, a recessed handle at each end, a dark inert status strip on the lid, chipped hazard paint and salt stains. No text, no logos.</w:t>
+              <w:t>Design a single game asset: A SALVAGE CASE of the year 2300, 80 cm long, 60 cm wide and 60 cm tall — a moulded composite shell with recessed seams and reinforced corners, scuffed panels, two heavy over-centre latches, a recessed handle at each end, a dark inert status strip on the lid, chipped hazard paint and salt stains. No text, no logos. EXACT SIZE IN THE GAME: 0.8 × 0.6 × 0.6 m — draw it at exactly those proportions.</w:t>
             </w:r>
           </w:p>
           <w:p>
@@ -3506,7 +3506,7 @@
                 <w:color w:val="1B2430"/>
                 <w:sz w:val="17"/>
               </w:rPr>
-              <w:t>Design a single game asset: A COIL OF HEAVY SALVAGE LINE lying flat on the ground — 1.2 metres across and 30 cm high, thick braided filament cable in a woven sheath with a magnetic coupling head on the loose end and a clamp collar holding the coil, oily and salt-stained.</w:t>
+              <w:t>Design a single game asset: A COIL OF HEAVY SALVAGE LINE lying flat on the ground — 1.2 metres across and 30 cm high, thick braided filament cable in a woven sheath with a magnetic coupling head on the loose end and a clamp collar holding the coil, oily and salt-stained. EXACT SIZE IN THE GAME: 1.2 m across × 0.3 m high — draw it at exactly those proportions.</w:t>
             </w:r>
           </w:p>
           <w:p>
@@ -3661,7 +3661,7 @@
                 <w:color w:val="1B2430"/>
                 <w:sz w:val="17"/>
               </w:rPr>
-              <w:t>Design a single game asset: AN EMERGENCY BUOYANCY RING ON A POST of the year 2300 — an 80 cm ring of segmented orange and white composite with an inflation collar and a small dark beacon module, hung on a slim alloy bracket post 1.2 metres tall with an amber strip at its base. Weathered, salt-stained, the orange faded. No text on the ring.</w:t>
+              <w:t>Design a single game asset: AN EMERGENCY BUOYANCY RING ON A POST of the year 2300 — an 80 cm ring of segmented orange and white composite with an inflation collar and a small dark beacon module, hung on a slim alloy bracket post 1.2 metres tall with an amber strip at its base. Weathered, salt-stained, the orange faded. No text on the ring. EXACT SIZE IN THE GAME: 0.8 m ring on a 1.2 m post — draw it at exactly those proportions.</w:t>
             </w:r>
           </w:p>
           <w:p>
@@ -3819,7 +3819,7 @@
                 <w:color w:val="1B2430"/>
                 <w:sz w:val="17"/>
               </w:rPr>
-              <w:t>Design a single game asset: A FIELD TOOL CASE of the year 2300, 70 cm long, 40 cm wide and 40 cm tall — a moulded composite shell, its hinged lid partly open showing shaped foam recesses, a recessed handle, two latches, a dark inert charge strip on the side, chipped orange paint over grey composite and grease marks. No text.</w:t>
+              <w:t>Design a single game asset: A FIELD TOOL CASE of the year 2300, 70 cm long, 40 cm wide and 40 cm tall — a moulded composite shell, its hinged lid partly open showing shaped foam recesses, a recessed handle, two latches, a dark inert charge strip on the side, chipped orange paint over grey composite and grease marks. No text. EXACT SIZE IN THE GAME: 0.7 × 0.4 × 0.4 m — draw it at exactly those proportions.</w:t>
             </w:r>
           </w:p>
           <w:p>
@@ -3969,7 +3969,7 @@
                 <w:color w:val="FFFFFF"/>
                 <w:sz w:val="19"/>
               </w:rPr>
-              <w:t>Prompt — paste blocks A + B + C together</w:t>
+              <w:t>Prompt — paste blocks A + B + C together (the size is inside [B])</w:t>
             </w:r>
           </w:p>
         </w:tc>
@@ -4099,7 +4099,7 @@
                 <w:color w:val="1B2430"/>
                 <w:sz w:val="17"/>
               </w:rPr>
-              <w:t>Design a single game asset: A CREW COUCH from a 2300 ship — 2 metres long, 85 cm deep and 80 cm tall: a low moulded composite shell on a magnetic deck base, thick worn cushions in dull teal synthetic, repair tape over a split seam, the arms rubbed through to the foam, a thin amber strip along the base and a recessed cup well in one arm, clamped to the floor. Heavy, cheap, industrial — not a home sofa.</w:t>
+              <w:t>Design a single game asset: A CREW COUCH from a 2300 ship — 2 metres long, 85 cm deep and 80 cm tall: a low moulded composite shell on a magnetic deck base, thick worn cushions in dull teal synthetic, repair tape over a split seam, the arms rubbed through to the foam, a thin amber strip along the base and a recessed cup well in one arm, clamped to the floor. Heavy, cheap, industrial — not a home sofa. EXACT SIZE IN THE GAME: 2.0 m long × 0.85 m deep × 0.8 m high — draw it at exactly those proportions.</w:t>
             </w:r>
           </w:p>
           <w:p>
@@ -4257,7 +4257,7 @@
                 <w:color w:val="1B2430"/>
                 <w:sz w:val="17"/>
               </w:rPr>
-              <w:t>Design a single game asset: A CREW BENCH from a 2300 ship — 1.6 metres long and 45 cm tall, a slatted composite seat on a slim alloy frame magnetically clamped to the floor, a shallow gear rack underneath, chipped grey paint, salt corrosion, one slat replaced with a mismatched panel.</w:t>
+              <w:t>Design a single game asset: A CREW BENCH from a 2300 ship — 1.6 metres long and 45 cm tall, a slatted composite seat on a slim alloy frame magnetically clamped to the floor, a shallow gear rack underneath, chipped grey paint, salt corrosion, one slat replaced with a mismatched panel. EXACT SIZE IN THE GAME: 1.6 m long × 0.45 m deep × 0.45 m high — draw it at exactly those proportions.</w:t>
             </w:r>
           </w:p>
           <w:p>
@@ -4412,7 +4412,7 @@
                 <w:color w:val="1B2430"/>
                 <w:sz w:val="17"/>
               </w:rPr>
-              <w:t>Design a single game asset: A MESS TABLE from a 2300 ship — 1.2 metres by 80 cm and 75 cm tall, a scratched composite top with a raised lip and recessed magnetic cup rings so nothing does slide, a single heavy pedestal on a magnetic deck plate, a thin amber strip round the rim, corrosion at the base and ring stains on the top.</w:t>
+              <w:t>Design a single game asset: A MESS TABLE from a 2300 ship — 1.2 metres by 80 cm and 75 cm tall, a scratched composite top with a raised lip and recessed magnetic cup rings so nothing does slide, a single heavy pedestal on a magnetic deck plate, a thin amber strip round the rim, corrosion at the base and ring stains on the top. EXACT SIZE IN THE GAME: 1.2 m × 0.8 m × 0.75 m high — draw it at exactly those proportions.</w:t>
             </w:r>
           </w:p>
           <w:p>
@@ -4562,7 +4562,7 @@
                 <w:color w:val="FFFFFF"/>
                 <w:sz w:val="19"/>
               </w:rPr>
-              <w:t>Prompt — paste blocks A + B + C together</w:t>
+              <w:t>Prompt — paste blocks A + B + C together (the size is inside [B])</w:t>
             </w:r>
           </w:p>
         </w:tc>
@@ -4692,7 +4692,7 @@
                 <w:color w:val="1B2430"/>
                 <w:sz w:val="17"/>
               </w:rPr>
-              <w:t>Design a single game asset: A SHIP NAME PLATE of the year 2300 — a composite plate 3 metres wide and 60 cm tall with the words BLACK TIDE SALVAGE recessed into the panel in bold worn capitals with a dead amber light channel behind them, corrosion bleeding from the fixings, the coating half gone. Flat plate seen straight on, nothing else around it.</w:t>
+              <w:t>Design a single game asset: A SHIP NAME PLATE of the year 2300 — a composite plate 3 metres wide and 60 cm tall with the words BLACK TIDE SALVAGE recessed into the panel in bold worn capitals with a dead amber light channel behind them, corrosion bleeding from the fixings, the coating half gone. Flat plate seen straight on, nothing else around it. EXACT SIZE IN THE GAME: 3 m wide × 0.6 m high — draw it at exactly those proportions.</w:t>
             </w:r>
           </w:p>
           <w:p>
@@ -4850,7 +4850,7 @@
                 <w:color w:val="1B2430"/>
                 <w:sz w:val="17"/>
               </w:rPr>
-              <w:t>Design a single game asset: A SET OF THREE HAZARD PLACARDS of the year 2300, each about 60 cm by 40 cm on scuffed composite backing panels — one amber triangle warning, one red circular prohibition, one cyan instruction, each symbol recessed into the panel with a faint light channel behind it, simple symbols and no readable words. Scratched, faded, salt-stained. The three side by side.</w:t>
+              <w:t>Design a single game asset: A SET OF THREE HAZARD PLACARDS of the year 2300, each about 60 cm by 40 cm on scuffed composite backing panels — one amber triangle warning, one red circular prohibition, one cyan instruction, each symbol recessed into the panel with a faint light channel behind it, simple symbols and no readable words. Scratched, faded, salt-stained. The three side by side. EXACT SIZE IN THE GAME: 0.6 m × 0.4 m each — draw it at exactly those proportions.</w:t>
             </w:r>
           </w:p>
           <w:p>
@@ -5000,7 +5000,7 @@
                 <w:color w:val="FFFFFF"/>
                 <w:sz w:val="19"/>
               </w:rPr>
-              <w:t>Prompt — paste blocks A + B + C together</w:t>
+              <w:t>Prompt — paste blocks A + B + C together (the size is inside [B])</w:t>
             </w:r>
           </w:p>
         </w:tc>
@@ -5130,7 +5130,7 @@
                 <w:color w:val="1B2430"/>
                 <w:sz w:val="17"/>
               </w:rPr>
-              <w:t>Design a single game asset: THE FRAME OF A ROUND DEEP-SEA ELEVATOR CAR of the year 2300 — 5 metres across and 3.5 metres tall: four heavy alloy posts, a ribbed pressure ring at the top and another at the bottom, curved bracing between them, clamp flanges, recessed cyan light strips up the posts, a ring of downlights under the top hoop and orange hazard chevrons worn off the edges. NO GLASS anywhere, NO FLOOR, and one side left as an open gap 2 metres wide for the doorway.</w:t>
+              <w:t>Design a single game asset: THE FRAME OF A ROUND DEEP-SEA ELEVATOR CAR of the year 2300 — 5 metres across and 3.5 metres tall: four heavy alloy posts, a ribbed pressure ring at the top and another at the bottom, curved bracing between them, clamp flanges, recessed cyan light strips up the posts, a ring of downlights under the top hoop and orange hazard chevrons worn off the edges. NO GLASS anywhere, NO FLOOR, and one side left as an open gap 2 metres wide for the doorway. EXACT SIZE IN THE GAME: 5 m across × 3.5 m high, doorway 2 m — draw it at exactly those proportions.</w:t>
             </w:r>
           </w:p>
           <w:p>
@@ -5288,7 +5288,7 @@
                 <w:color w:val="1B2430"/>
                 <w:sz w:val="17"/>
               </w:rPr>
-              <w:t>Design a single game asset: A CONTROL PANEL of the year 2300, 60 cm wide, 40 cm tall and 8 cm deep — a sealed composite box with a sloped face, a raised protective lip with a thin cyan strip along it, a cable gland at the bottom, magnetic mounting pads at the corners, scuffed and salt-etched. The face inside the lip is completely flat, blank and dark, with no buttons and no lights on it.</w:t>
+              <w:t>Design a single game asset: A CONTROL PANEL of the year 2300, 60 cm wide, 40 cm tall and 8 cm deep — a sealed composite box with a sloped face, a raised protective lip with a thin cyan strip along it, a cable gland at the bottom, magnetic mounting pads at the corners, scuffed and salt-etched. The face inside the lip is completely flat, blank and dark, with no buttons and no lights on it. EXACT SIZE IN THE GAME: 0.6 m wide × 0.4 m high × 0.08 m deep — draw it at exactly those proportions.</w:t>
             </w:r>
           </w:p>
           <w:p>
@@ -5443,7 +5443,7 @@
                 <w:color w:val="1B2430"/>
                 <w:sz w:val="17"/>
               </w:rPr>
-              <w:t>Design a single game asset: ONE SECTION OF A DEEP-SEA ELEVATOR TUBE of the year 2300 — an open cage ring 5 metres across and 2 metres tall: two pressure hoops joined by six vertical ribs, clamp plates at every joint, a conduit run and a recessed cyan light strip up one rib, salt corrosion and worn orange chevrons. The top and bottom edges are flat and identical so sections stack seamlessly. Completely hollow — NO GLASS between the ribs, no floor, no walls.</w:t>
+              <w:t>Design a single game asset: ONE SECTION OF A DEEP-SEA ELEVATOR TUBE of the year 2300 — an open cage ring 5 metres across and 2 metres tall: two pressure hoops joined by six vertical ribs, clamp plates at every joint, a conduit run and a recessed cyan light strip up one rib, salt corrosion and worn orange chevrons. The top and bottom edges are flat and identical so sections stack seamlessly. Completely hollow — NO GLASS between the ribs, no floor, no walls. EXACT SIZE IN THE GAME: 5 m across × 2 m high — draw it at exactly those proportions.</w:t>
             </w:r>
           </w:p>
           <w:p>
@@ -5601,7 +5601,7 @@
                 <w:color w:val="1B2430"/>
                 <w:sz w:val="17"/>
               </w:rPr>
-              <w:t>Design a single game asset: THE FOOT OF A DEEP-SEA ELEVATOR TUBE of the year 2300, where it meets the sea floor — a wide braced base 7 metres across and 3 metres tall, splayed buttress legs on magnetic footplates bedded into silt, heavy pressure flanges, two downlight pods and cyan strips round the rim, biofouling and corrosion up to knee height. ONE SIDE HAS AN OPEN DOORWAY 2 metres wide with no doors in it — leave that gap completely empty. Hollow inside.</w:t>
+              <w:t>Design a single game asset: THE FOOT OF A DEEP-SEA ELEVATOR TUBE of the year 2300, where it meets the sea floor — a wide braced base 7 metres across and 3 metres tall, splayed buttress legs on magnetic footplates bedded into silt, heavy pressure flanges, two downlight pods and cyan strips round the rim, biofouling and corrosion up to knee height. ONE SIDE HAS AN OPEN DOORWAY 2 metres wide with no doors in it — leave that gap completely empty. Hollow inside. EXACT SIZE IN THE GAME: 7 m across × 3 m high, doorway 2 m — draw it at exactly those proportions.</w:t>
             </w:r>
           </w:p>
           <w:p>
@@ -5751,7 +5751,7 @@
                 <w:color w:val="FFFFFF"/>
                 <w:sz w:val="19"/>
               </w:rPr>
-              <w:t>Prompt — paste blocks A + B + C together</w:t>
+              <w:t>Prompt — paste blocks A + B + C together (the size is inside [B])</w:t>
             </w:r>
           </w:p>
         </w:tc>
@@ -5881,7 +5881,7 @@
                 <w:color w:val="1B2430"/>
                 <w:sz w:val="17"/>
               </w:rPr>
-              <w:t>A seamless tiling texture of a worn 2300 ship deck: wide composite panels with recessed seams and a hexagonal anti-slip tread, thin inset light channels that are dead and grey, corrosion blooms at the joints, chipped coating, faint orange hazard chevron fragments, salt stains. Low-poly stylised game texture, flat colours, high contrast.</w:t>
+              <w:t>A seamless tiling texture of a worn 2300 ship deck: wide composite panels with recessed seams and a hexagonal anti-slip tread, thin inset light channels that are dead and grey, corrosion blooms at the joints, chipped coating, faint orange hazard chevron fragments, salt stains. Low-poly stylised game texture, flat colours, high contrast. One tile should read as about 2 metres of real surface, so the detail is not too fine.</w:t>
             </w:r>
           </w:p>
           <w:p>
@@ -6039,7 +6039,7 @@
                 <w:color w:val="1B2430"/>
                 <w:sz w:val="17"/>
               </w:rPr>
-              <w:t>A seamless tiling texture of 2300 composite hull armour: large panels with deep recessed seams and a faint hex weave, clamp studs along the joins, corrosion streaks running downward, flaking dark coating over pale composite, biofouling specks. Low-poly stylised game texture, flat colours, high contrast.</w:t>
+              <w:t>A seamless tiling texture of 2300 composite hull armour: large panels with deep recessed seams and a faint hex weave, clamp studs along the joins, corrosion streaks running downward, flaking dark coating over pale composite, biofouling specks. Low-poly stylised game texture, flat colours, high contrast. One tile should read as about 2 metres of real surface, so the detail is not too fine.</w:t>
             </w:r>
           </w:p>
           <w:p>
@@ -6194,7 +6194,7 @@
                 <w:color w:val="1B2430"/>
                 <w:sz w:val="17"/>
               </w:rPr>
-              <w:t>A seamless tiling grunge overlay for 2300 composite panels: corrosion blooms, oil streaks, salt crust, micro-scratches and faint hex-weave wear on a flat neutral grey background, no obvious shapes or edges, evenly spread so nothing stands out when it repeats.</w:t>
+              <w:t>A seamless tiling grunge overlay for 2300 composite panels: corrosion blooms, oil streaks, salt crust, micro-scratches and faint hex-weave wear on a flat neutral grey background, no obvious shapes or edges, evenly spread so nothing stands out when it repeats. One tile should read as about 2 metres of real surface, so the detail is not too fine.</w:t>
             </w:r>
           </w:p>
           <w:p>

</xml_diff>